<commit_message>
UID: lab2 analisys fixes required. lab3 started
</commit_message>
<xml_diff>
--- a/UID/Lab texts/Лабораторная работа №3_ПОИТ.docx
+++ b/UID/Lab texts/Лабораторная работа №3_ПОИТ.docx
@@ -1,6 +1,6 @@
 
 <file path=word/document.xml><?xml version="1.0" encoding="utf-8"?>
-<w:document xmlns:wpc="http://schemas.microsoft.com/office/word/2010/wordprocessingCanvas" xmlns:mc="http://schemas.openxmlformats.org/markup-compatibility/2006" xmlns:o="urn:schemas-microsoft-com:office:office" xmlns:r="http://schemas.openxmlformats.org/officeDocument/2006/relationships" xmlns:m="http://schemas.openxmlformats.org/officeDocument/2006/math" xmlns:v="urn:schemas-microsoft-com:vml" xmlns:wp14="http://schemas.microsoft.com/office/word/2010/wordprocessingDrawing" xmlns:wp="http://schemas.openxmlformats.org/drawingml/2006/wordprocessingDrawing" xmlns:w10="urn:schemas-microsoft-com:office:word" xmlns:w="http://schemas.openxmlformats.org/wordprocessingml/2006/main" xmlns:w14="http://schemas.microsoft.com/office/word/2010/wordml" xmlns:w15="http://schemas.microsoft.com/office/word/2012/wordml" xmlns:wpg="http://schemas.microsoft.com/office/word/2010/wordprocessingGroup" xmlns:wpi="http://schemas.microsoft.com/office/word/2010/wordprocessingInk" xmlns:wne="http://schemas.microsoft.com/office/word/2006/wordml" xmlns:wps="http://schemas.microsoft.com/office/word/2010/wordprocessingShape" mc:Ignorable="w14 w15 wp14">
+<w:document xmlns:wpc="http://schemas.microsoft.com/office/word/2010/wordprocessingCanvas" xmlns:cx="http://schemas.microsoft.com/office/drawing/2014/chartex" xmlns:cx1="http://schemas.microsoft.com/office/drawing/2015/9/8/chartex" xmlns:cx2="http://schemas.microsoft.com/office/drawing/2015/10/21/chartex" xmlns:cx3="http://schemas.microsoft.com/office/drawing/2016/5/9/chartex" xmlns:cx4="http://schemas.microsoft.com/office/drawing/2016/5/10/chartex" xmlns:cx5="http://schemas.microsoft.com/office/drawing/2016/5/11/chartex" xmlns:cx6="http://schemas.microsoft.com/office/drawing/2016/5/12/chartex" xmlns:cx7="http://schemas.microsoft.com/office/drawing/2016/5/13/chartex" xmlns:cx8="http://schemas.microsoft.com/office/drawing/2016/5/14/chartex" xmlns:mc="http://schemas.openxmlformats.org/markup-compatibility/2006" xmlns:aink="http://schemas.microsoft.com/office/drawing/2016/ink" xmlns:am3d="http://schemas.microsoft.com/office/drawing/2017/model3d" xmlns:o="urn:schemas-microsoft-com:office:office" xmlns:r="http://schemas.openxmlformats.org/officeDocument/2006/relationships" xmlns:m="http://schemas.openxmlformats.org/officeDocument/2006/math" xmlns:v="urn:schemas-microsoft-com:vml" xmlns:wp14="http://schemas.microsoft.com/office/word/2010/wordprocessingDrawing" xmlns:wp="http://schemas.openxmlformats.org/drawingml/2006/wordprocessingDrawing" xmlns:w10="urn:schemas-microsoft-com:office:word" xmlns:w="http://schemas.openxmlformats.org/wordprocessingml/2006/main" xmlns:w14="http://schemas.microsoft.com/office/word/2010/wordml" xmlns:w15="http://schemas.microsoft.com/office/word/2012/wordml" xmlns:w16cex="http://schemas.microsoft.com/office/word/2018/wordml/cex" xmlns:w16cid="http://schemas.microsoft.com/office/word/2016/wordml/cid" xmlns:w16="http://schemas.microsoft.com/office/word/2018/wordml" xmlns:w16sdtdh="http://schemas.microsoft.com/office/word/2020/wordml/sdtdatahash" xmlns:w16se="http://schemas.microsoft.com/office/word/2015/wordml/symex" xmlns:wpg="http://schemas.microsoft.com/office/word/2010/wordprocessingGroup" xmlns:wpi="http://schemas.microsoft.com/office/word/2010/wordprocessingInk" xmlns:wne="http://schemas.microsoft.com/office/word/2006/wordml" xmlns:wps="http://schemas.microsoft.com/office/word/2010/wordprocessingShape" mc:Ignorable="w14 w15 w16se w16cid w16 w16cex w16sdtdh wp14">
   <w:body>
     <w:p>
       <w:pPr>
@@ -67,8 +67,6 @@
         </w:rPr>
         <w:t>)</w:t>
       </w:r>
-      <w:bookmarkStart w:id="0" w:name="_GoBack"/>
-      <w:bookmarkEnd w:id="0"/>
     </w:p>
     <w:p>
       <w:pPr>
@@ -180,23 +178,7 @@
           <w:sz w:val="28"/>
           <w:szCs w:val="28"/>
         </w:rPr>
-        <w:t xml:space="preserve">при помощи таких инструментов, как </w:t>
-      </w:r>
-      <w:r>
-        <w:rPr>
-          <w:rFonts w:ascii="Times New Roman" w:hAnsi="Times New Roman" w:cs="Times New Roman"/>
-          <w:sz w:val="28"/>
-          <w:szCs w:val="28"/>
-        </w:rPr>
-        <w:t>User Story</w:t>
-      </w:r>
-      <w:r>
-        <w:rPr>
-          <w:rFonts w:ascii="Times New Roman" w:hAnsi="Times New Roman" w:cs="Times New Roman"/>
-          <w:sz w:val="28"/>
-          <w:szCs w:val="28"/>
-        </w:rPr>
-        <w:t>,</w:t>
+        <w:t>при помощи таких инструментов, как User Story,</w:t>
       </w:r>
       <w:r>
         <w:rPr>
@@ -908,7 +890,7 @@
           <w:szCs w:val="28"/>
           <w:shd w:val="clear" w:color="auto" w:fill="FFFFFF"/>
         </w:rPr>
-        <w:t>Месторасположение.</w:t>
+        <w:t>Месторасположение</w:t>
       </w:r>
     </w:p>
     <w:p>
@@ -1760,7 +1742,7 @@
         </w:rPr>
         <w:lastRenderedPageBreak/>
         <w:drawing>
-          <wp:inline distT="0" distB="0" distL="0" distR="0">
+          <wp:inline distT="0" distB="0" distL="0" distR="0" wp14:anchorId="1212D127" wp14:editId="76EE7079">
             <wp:extent cx="3040380" cy="2361452"/>
             <wp:effectExtent l="0" t="0" r="7620" b="1270"/>
             <wp:docPr id="8" name="Рисунок 8"/>
@@ -3010,7 +2992,7 @@
           <w:lang w:eastAsia="ru-RU"/>
         </w:rPr>
         <w:drawing>
-          <wp:inline distT="0" distB="0" distL="0" distR="0">
+          <wp:inline distT="0" distB="0" distL="0" distR="0" wp14:anchorId="345DD1B6" wp14:editId="0E43016C">
             <wp:extent cx="4312120" cy="3040380"/>
             <wp:effectExtent l="0" t="0" r="0" b="7620"/>
             <wp:docPr id="12" name="Рисунок 12"/>
@@ -3998,7 +3980,7 @@
         </w:rPr>
         <w:lastRenderedPageBreak/>
         <w:drawing>
-          <wp:inline distT="0" distB="0" distL="0" distR="0">
+          <wp:inline distT="0" distB="0" distL="0" distR="0" wp14:anchorId="3B9A3898" wp14:editId="2679E714">
             <wp:extent cx="5940425" cy="4261485"/>
             <wp:effectExtent l="0" t="0" r="3175" b="5715"/>
             <wp:docPr id="16" name="Рисунок 16"/>
@@ -4642,23 +4624,7 @@
           <w:sz w:val="28"/>
           <w:szCs w:val="28"/>
         </w:rPr>
-        <w:t xml:space="preserve"> показаны на рисунке </w:t>
-      </w:r>
-      <w:r>
-        <w:rPr>
-          <w:rFonts w:ascii="Times New Roman" w:hAnsi="Times New Roman" w:cs="Times New Roman"/>
-          <w:sz w:val="28"/>
-          <w:szCs w:val="28"/>
-        </w:rPr>
-        <w:t>4</w:t>
-      </w:r>
-      <w:r>
-        <w:rPr>
-          <w:rFonts w:ascii="Times New Roman" w:hAnsi="Times New Roman" w:cs="Times New Roman"/>
-          <w:sz w:val="28"/>
-          <w:szCs w:val="28"/>
-        </w:rPr>
-        <w:t>.</w:t>
+        <w:t xml:space="preserve"> показаны на рисунке 4.</w:t>
       </w:r>
     </w:p>
     <w:p>
@@ -4686,7 +4652,7 @@
           <w:lang w:eastAsia="ru-RU"/>
         </w:rPr>
         <w:drawing>
-          <wp:inline distT="0" distB="0" distL="0" distR="0" wp14:anchorId="63E86A95" wp14:editId="664DB117">
+          <wp:inline distT="0" distB="0" distL="0" distR="0" wp14:anchorId="2DA2A529" wp14:editId="53A6E6E4">
             <wp:extent cx="4069080" cy="1377100"/>
             <wp:effectExtent l="0" t="0" r="7620" b="0"/>
             <wp:docPr id="15" name="Рисунок 15" descr="C:\Users\Say My Name\Downloads\Frame 2.jpg"/>
@@ -4845,23 +4811,7 @@
           <w:sz w:val="28"/>
           <w:szCs w:val="28"/>
         </w:rPr>
-        <w:t xml:space="preserve"> Схематично данный подход показан на рисунке </w:t>
-      </w:r>
-      <w:r>
-        <w:rPr>
-          <w:rFonts w:ascii="Times New Roman" w:hAnsi="Times New Roman" w:cs="Times New Roman"/>
-          <w:sz w:val="28"/>
-          <w:szCs w:val="28"/>
-        </w:rPr>
-        <w:t>5</w:t>
-      </w:r>
-      <w:r>
-        <w:rPr>
-          <w:rFonts w:ascii="Times New Roman" w:hAnsi="Times New Roman" w:cs="Times New Roman"/>
-          <w:sz w:val="28"/>
-          <w:szCs w:val="28"/>
-        </w:rPr>
-        <w:t>.</w:t>
+        <w:t xml:space="preserve"> Схематично данный подход показан на рисунке 5.</w:t>
       </w:r>
     </w:p>
     <w:p>
@@ -4889,7 +4839,7 @@
           <w:lang w:eastAsia="ru-RU"/>
         </w:rPr>
         <w:drawing>
-          <wp:inline distT="0" distB="0" distL="0" distR="0" wp14:anchorId="4D8FACD3" wp14:editId="1BE602F4">
+          <wp:inline distT="0" distB="0" distL="0" distR="0" wp14:anchorId="44F4A03B" wp14:editId="77B3C462">
             <wp:extent cx="4389120" cy="1485411"/>
             <wp:effectExtent l="0" t="0" r="0" b="635"/>
             <wp:docPr id="18" name="Рисунок 18" descr="C:\Users\Say My Name\Downloads\Frame 2 (1).jpg"/>
@@ -5752,23 +5702,7 @@
           <w:sz w:val="28"/>
           <w:szCs w:val="28"/>
         </w:rPr>
-        <w:t xml:space="preserve"> представлен на рисунке </w:t>
-      </w:r>
-      <w:r>
-        <w:rPr>
-          <w:rFonts w:ascii="Times New Roman" w:hAnsi="Times New Roman" w:cs="Times New Roman"/>
-          <w:sz w:val="28"/>
-          <w:szCs w:val="28"/>
-        </w:rPr>
-        <w:t>6</w:t>
-      </w:r>
-      <w:r>
-        <w:rPr>
-          <w:rFonts w:ascii="Times New Roman" w:hAnsi="Times New Roman" w:cs="Times New Roman"/>
-          <w:sz w:val="28"/>
-          <w:szCs w:val="28"/>
-        </w:rPr>
-        <w:t>.</w:t>
+        <w:t xml:space="preserve"> представлен на рисунке 6.</w:t>
       </w:r>
     </w:p>
     <w:p>
@@ -5795,7 +5729,7 @@
           <w:lang w:eastAsia="ru-RU"/>
         </w:rPr>
         <w:drawing>
-          <wp:inline distT="0" distB="0" distL="0" distR="0" wp14:anchorId="620C1E7C" wp14:editId="05FA5EB5">
+          <wp:inline distT="0" distB="0" distL="0" distR="0" wp14:anchorId="4681D258" wp14:editId="7D6F65CA">
             <wp:extent cx="5542873" cy="2979420"/>
             <wp:effectExtent l="0" t="0" r="1270" b="0"/>
             <wp:docPr id="21" name="Рисунок 21" descr="C:\Users\Say My Name\Downloads\Slide 16_9 - 7 (2).jpg"/>
@@ -6517,15 +6451,7 @@
           <w:sz w:val="28"/>
           <w:szCs w:val="28"/>
         </w:rPr>
-        <w:t xml:space="preserve"> (минимум по 3 для каждого потенциального пользователя)</w:t>
-      </w:r>
-      <w:r>
-        <w:rPr>
-          <w:rFonts w:ascii="Times New Roman" w:hAnsi="Times New Roman" w:cs="Times New Roman"/>
-          <w:sz w:val="28"/>
-          <w:szCs w:val="28"/>
-        </w:rPr>
-        <w:t xml:space="preserve">, используя подход </w:t>
+        <w:t xml:space="preserve"> (минимум по 3 для каждого потенциального пользователя), используя подход </w:t>
       </w:r>
       <w:r>
         <w:rPr>
@@ -7534,7 +7460,7 @@
 </file>
 
 <file path=word/endnotes.xml><?xml version="1.0" encoding="utf-8"?>
-<w:endnotes xmlns:wpc="http://schemas.microsoft.com/office/word/2010/wordprocessingCanvas" xmlns:mc="http://schemas.openxmlformats.org/markup-compatibility/2006" xmlns:o="urn:schemas-microsoft-com:office:office" xmlns:r="http://schemas.openxmlformats.org/officeDocument/2006/relationships" xmlns:m="http://schemas.openxmlformats.org/officeDocument/2006/math" xmlns:v="urn:schemas-microsoft-com:vml" xmlns:wp14="http://schemas.microsoft.com/office/word/2010/wordprocessingDrawing" xmlns:wp="http://schemas.openxmlformats.org/drawingml/2006/wordprocessingDrawing" xmlns:w10="urn:schemas-microsoft-com:office:word" xmlns:w="http://schemas.openxmlformats.org/wordprocessingml/2006/main" xmlns:w14="http://schemas.microsoft.com/office/word/2010/wordml" xmlns:w15="http://schemas.microsoft.com/office/word/2012/wordml" xmlns:wpg="http://schemas.microsoft.com/office/word/2010/wordprocessingGroup" xmlns:wpi="http://schemas.microsoft.com/office/word/2010/wordprocessingInk" xmlns:wne="http://schemas.microsoft.com/office/word/2006/wordml" xmlns:wps="http://schemas.microsoft.com/office/word/2010/wordprocessingShape" mc:Ignorable="w14 w15 wp14">
+<w:endnotes xmlns:wpc="http://schemas.microsoft.com/office/word/2010/wordprocessingCanvas" xmlns:cx="http://schemas.microsoft.com/office/drawing/2014/chartex" xmlns:cx1="http://schemas.microsoft.com/office/drawing/2015/9/8/chartex" xmlns:cx2="http://schemas.microsoft.com/office/drawing/2015/10/21/chartex" xmlns:cx3="http://schemas.microsoft.com/office/drawing/2016/5/9/chartex" xmlns:cx4="http://schemas.microsoft.com/office/drawing/2016/5/10/chartex" xmlns:cx5="http://schemas.microsoft.com/office/drawing/2016/5/11/chartex" xmlns:cx6="http://schemas.microsoft.com/office/drawing/2016/5/12/chartex" xmlns:cx7="http://schemas.microsoft.com/office/drawing/2016/5/13/chartex" xmlns:cx8="http://schemas.microsoft.com/office/drawing/2016/5/14/chartex" xmlns:mc="http://schemas.openxmlformats.org/markup-compatibility/2006" xmlns:aink="http://schemas.microsoft.com/office/drawing/2016/ink" xmlns:am3d="http://schemas.microsoft.com/office/drawing/2017/model3d" xmlns:o="urn:schemas-microsoft-com:office:office" xmlns:r="http://schemas.openxmlformats.org/officeDocument/2006/relationships" xmlns:m="http://schemas.openxmlformats.org/officeDocument/2006/math" xmlns:v="urn:schemas-microsoft-com:vml" xmlns:wp14="http://schemas.microsoft.com/office/word/2010/wordprocessingDrawing" xmlns:wp="http://schemas.openxmlformats.org/drawingml/2006/wordprocessingDrawing" xmlns:w10="urn:schemas-microsoft-com:office:word" xmlns:w="http://schemas.openxmlformats.org/wordprocessingml/2006/main" xmlns:w14="http://schemas.microsoft.com/office/word/2010/wordml" xmlns:w15="http://schemas.microsoft.com/office/word/2012/wordml" xmlns:w16cex="http://schemas.microsoft.com/office/word/2018/wordml/cex" xmlns:w16cid="http://schemas.microsoft.com/office/word/2016/wordml/cid" xmlns:w16="http://schemas.microsoft.com/office/word/2018/wordml" xmlns:w16sdtdh="http://schemas.microsoft.com/office/word/2020/wordml/sdtdatahash" xmlns:w16se="http://schemas.microsoft.com/office/word/2015/wordml/symex" xmlns:wpg="http://schemas.microsoft.com/office/word/2010/wordprocessingGroup" xmlns:wpi="http://schemas.microsoft.com/office/word/2010/wordprocessingInk" xmlns:wne="http://schemas.microsoft.com/office/word/2006/wordml" xmlns:wps="http://schemas.microsoft.com/office/word/2010/wordprocessingShape" mc:Ignorable="w14 w15 w16se w16cid w16 w16cex w16sdtdh wp14">
   <w:endnote w:type="separator" w:id="-1">
     <w:p>
       <w:pPr>
@@ -7559,7 +7485,7 @@
 </file>
 
 <file path=word/footnotes.xml><?xml version="1.0" encoding="utf-8"?>
-<w:footnotes xmlns:wpc="http://schemas.microsoft.com/office/word/2010/wordprocessingCanvas" xmlns:mc="http://schemas.openxmlformats.org/markup-compatibility/2006" xmlns:o="urn:schemas-microsoft-com:office:office" xmlns:r="http://schemas.openxmlformats.org/officeDocument/2006/relationships" xmlns:m="http://schemas.openxmlformats.org/officeDocument/2006/math" xmlns:v="urn:schemas-microsoft-com:vml" xmlns:wp14="http://schemas.microsoft.com/office/word/2010/wordprocessingDrawing" xmlns:wp="http://schemas.openxmlformats.org/drawingml/2006/wordprocessingDrawing" xmlns:w10="urn:schemas-microsoft-com:office:word" xmlns:w="http://schemas.openxmlformats.org/wordprocessingml/2006/main" xmlns:w14="http://schemas.microsoft.com/office/word/2010/wordml" xmlns:w15="http://schemas.microsoft.com/office/word/2012/wordml" xmlns:wpg="http://schemas.microsoft.com/office/word/2010/wordprocessingGroup" xmlns:wpi="http://schemas.microsoft.com/office/word/2010/wordprocessingInk" xmlns:wne="http://schemas.microsoft.com/office/word/2006/wordml" xmlns:wps="http://schemas.microsoft.com/office/word/2010/wordprocessingShape" mc:Ignorable="w14 w15 wp14">
+<w:footnotes xmlns:wpc="http://schemas.microsoft.com/office/word/2010/wordprocessingCanvas" xmlns:cx="http://schemas.microsoft.com/office/drawing/2014/chartex" xmlns:cx1="http://schemas.microsoft.com/office/drawing/2015/9/8/chartex" xmlns:cx2="http://schemas.microsoft.com/office/drawing/2015/10/21/chartex" xmlns:cx3="http://schemas.microsoft.com/office/drawing/2016/5/9/chartex" xmlns:cx4="http://schemas.microsoft.com/office/drawing/2016/5/10/chartex" xmlns:cx5="http://schemas.microsoft.com/office/drawing/2016/5/11/chartex" xmlns:cx6="http://schemas.microsoft.com/office/drawing/2016/5/12/chartex" xmlns:cx7="http://schemas.microsoft.com/office/drawing/2016/5/13/chartex" xmlns:cx8="http://schemas.microsoft.com/office/drawing/2016/5/14/chartex" xmlns:mc="http://schemas.openxmlformats.org/markup-compatibility/2006" xmlns:aink="http://schemas.microsoft.com/office/drawing/2016/ink" xmlns:am3d="http://schemas.microsoft.com/office/drawing/2017/model3d" xmlns:o="urn:schemas-microsoft-com:office:office" xmlns:r="http://schemas.openxmlformats.org/officeDocument/2006/relationships" xmlns:m="http://schemas.openxmlformats.org/officeDocument/2006/math" xmlns:v="urn:schemas-microsoft-com:vml" xmlns:wp14="http://schemas.microsoft.com/office/word/2010/wordprocessingDrawing" xmlns:wp="http://schemas.openxmlformats.org/drawingml/2006/wordprocessingDrawing" xmlns:w10="urn:schemas-microsoft-com:office:word" xmlns:w="http://schemas.openxmlformats.org/wordprocessingml/2006/main" xmlns:w14="http://schemas.microsoft.com/office/word/2010/wordml" xmlns:w15="http://schemas.microsoft.com/office/word/2012/wordml" xmlns:w16cex="http://schemas.microsoft.com/office/word/2018/wordml/cex" xmlns:w16cid="http://schemas.microsoft.com/office/word/2016/wordml/cid" xmlns:w16="http://schemas.microsoft.com/office/word/2018/wordml" xmlns:w16sdtdh="http://schemas.microsoft.com/office/word/2020/wordml/sdtdatahash" xmlns:w16se="http://schemas.microsoft.com/office/word/2015/wordml/symex" xmlns:wpg="http://schemas.microsoft.com/office/word/2010/wordprocessingGroup" xmlns:wpi="http://schemas.microsoft.com/office/word/2010/wordprocessingInk" xmlns:wne="http://schemas.microsoft.com/office/word/2006/wordml" xmlns:wps="http://schemas.microsoft.com/office/word/2010/wordprocessingShape" mc:Ignorable="w14 w15 w16se w16cid w16 w16cex w16sdtdh wp14">
   <w:footnote w:type="separator" w:id="-1">
     <w:p>
       <w:pPr>
@@ -7584,8 +7510,8 @@
 </file>
 
 <file path=word/numbering.xml><?xml version="1.0" encoding="utf-8"?>
-<w:numbering xmlns:wpc="http://schemas.microsoft.com/office/word/2010/wordprocessingCanvas" xmlns:mc="http://schemas.openxmlformats.org/markup-compatibility/2006" xmlns:o="urn:schemas-microsoft-com:office:office" xmlns:r="http://schemas.openxmlformats.org/officeDocument/2006/relationships" xmlns:m="http://schemas.openxmlformats.org/officeDocument/2006/math" xmlns:v="urn:schemas-microsoft-com:vml" xmlns:wp14="http://schemas.microsoft.com/office/word/2010/wordprocessingDrawing" xmlns:wp="http://schemas.openxmlformats.org/drawingml/2006/wordprocessingDrawing" xmlns:w10="urn:schemas-microsoft-com:office:word" xmlns:w="http://schemas.openxmlformats.org/wordprocessingml/2006/main" xmlns:w14="http://schemas.microsoft.com/office/word/2010/wordml" xmlns:w15="http://schemas.microsoft.com/office/word/2012/wordml" xmlns:wpg="http://schemas.microsoft.com/office/word/2010/wordprocessingGroup" xmlns:wpi="http://schemas.microsoft.com/office/word/2010/wordprocessingInk" xmlns:wne="http://schemas.microsoft.com/office/word/2006/wordml" xmlns:wps="http://schemas.microsoft.com/office/word/2010/wordprocessingShape" mc:Ignorable="w14 w15 wp14">
-  <w:abstractNum w:abstractNumId="0">
+<w:numbering xmlns:wpc="http://schemas.microsoft.com/office/word/2010/wordprocessingCanvas" xmlns:cx="http://schemas.microsoft.com/office/drawing/2014/chartex" xmlns:cx1="http://schemas.microsoft.com/office/drawing/2015/9/8/chartex" xmlns:cx2="http://schemas.microsoft.com/office/drawing/2015/10/21/chartex" xmlns:cx3="http://schemas.microsoft.com/office/drawing/2016/5/9/chartex" xmlns:cx4="http://schemas.microsoft.com/office/drawing/2016/5/10/chartex" xmlns:cx5="http://schemas.microsoft.com/office/drawing/2016/5/11/chartex" xmlns:cx6="http://schemas.microsoft.com/office/drawing/2016/5/12/chartex" xmlns:cx7="http://schemas.microsoft.com/office/drawing/2016/5/13/chartex" xmlns:cx8="http://schemas.microsoft.com/office/drawing/2016/5/14/chartex" xmlns:mc="http://schemas.openxmlformats.org/markup-compatibility/2006" xmlns:aink="http://schemas.microsoft.com/office/drawing/2016/ink" xmlns:am3d="http://schemas.microsoft.com/office/drawing/2017/model3d" xmlns:o="urn:schemas-microsoft-com:office:office" xmlns:r="http://schemas.openxmlformats.org/officeDocument/2006/relationships" xmlns:m="http://schemas.openxmlformats.org/officeDocument/2006/math" xmlns:v="urn:schemas-microsoft-com:vml" xmlns:wp14="http://schemas.microsoft.com/office/word/2010/wordprocessingDrawing" xmlns:wp="http://schemas.openxmlformats.org/drawingml/2006/wordprocessingDrawing" xmlns:w10="urn:schemas-microsoft-com:office:word" xmlns:w="http://schemas.openxmlformats.org/wordprocessingml/2006/main" xmlns:w14="http://schemas.microsoft.com/office/word/2010/wordml" xmlns:w15="http://schemas.microsoft.com/office/word/2012/wordml" xmlns:w16cex="http://schemas.microsoft.com/office/word/2018/wordml/cex" xmlns:w16cid="http://schemas.microsoft.com/office/word/2016/wordml/cid" xmlns:w16="http://schemas.microsoft.com/office/word/2018/wordml" xmlns:w16sdtdh="http://schemas.microsoft.com/office/word/2020/wordml/sdtdatahash" xmlns:w16se="http://schemas.microsoft.com/office/word/2015/wordml/symex" xmlns:wpg="http://schemas.microsoft.com/office/word/2010/wordprocessingGroup" xmlns:wpi="http://schemas.microsoft.com/office/word/2010/wordprocessingInk" xmlns:wne="http://schemas.microsoft.com/office/word/2006/wordml" xmlns:wps="http://schemas.microsoft.com/office/word/2010/wordprocessingShape" mc:Ignorable="w14 w15 w16se w16cid w16 w16cex w16sdtdh wp14">
+  <w:abstractNum w:abstractNumId="0" w15:restartNumberingAfterBreak="0">
     <w:nsid w:val="0133433C"/>
     <w:multiLevelType w:val="hybridMultilevel"/>
     <w:tmpl w:val="51CED608"/>
@@ -7671,7 +7597,7 @@
       </w:pPr>
     </w:lvl>
   </w:abstractNum>
-  <w:abstractNum w:abstractNumId="1">
+  <w:abstractNum w:abstractNumId="1" w15:restartNumberingAfterBreak="0">
     <w:nsid w:val="08AB473B"/>
     <w:multiLevelType w:val="hybridMultilevel"/>
     <w:tmpl w:val="A9C2FC04"/>
@@ -7784,7 +7710,7 @@
       </w:rPr>
     </w:lvl>
   </w:abstractNum>
-  <w:abstractNum w:abstractNumId="2">
+  <w:abstractNum w:abstractNumId="2" w15:restartNumberingAfterBreak="0">
     <w:nsid w:val="0D302DF9"/>
     <w:multiLevelType w:val="hybridMultilevel"/>
     <w:tmpl w:val="D5D28F78"/>
@@ -7870,7 +7796,7 @@
       </w:pPr>
     </w:lvl>
   </w:abstractNum>
-  <w:abstractNum w:abstractNumId="3">
+  <w:abstractNum w:abstractNumId="3" w15:restartNumberingAfterBreak="0">
     <w:nsid w:val="0D4708E1"/>
     <w:multiLevelType w:val="hybridMultilevel"/>
     <w:tmpl w:val="BC8CC5E4"/>
@@ -7983,7 +7909,7 @@
       </w:rPr>
     </w:lvl>
   </w:abstractNum>
-  <w:abstractNum w:abstractNumId="4">
+  <w:abstractNum w:abstractNumId="4" w15:restartNumberingAfterBreak="0">
     <w:nsid w:val="11BC1B63"/>
     <w:multiLevelType w:val="hybridMultilevel"/>
     <w:tmpl w:val="B258670C"/>
@@ -8096,7 +8022,7 @@
       </w:rPr>
     </w:lvl>
   </w:abstractNum>
-  <w:abstractNum w:abstractNumId="5">
+  <w:abstractNum w:abstractNumId="5" w15:restartNumberingAfterBreak="0">
     <w:nsid w:val="18290BF2"/>
     <w:multiLevelType w:val="hybridMultilevel"/>
     <w:tmpl w:val="0572470E"/>
@@ -8185,7 +8111,7 @@
       </w:pPr>
     </w:lvl>
   </w:abstractNum>
-  <w:abstractNum w:abstractNumId="6">
+  <w:abstractNum w:abstractNumId="6" w15:restartNumberingAfterBreak="0">
     <w:nsid w:val="20D5349B"/>
     <w:multiLevelType w:val="hybridMultilevel"/>
     <w:tmpl w:val="CA9A079C"/>
@@ -8274,7 +8200,7 @@
       </w:pPr>
     </w:lvl>
   </w:abstractNum>
-  <w:abstractNum w:abstractNumId="7">
+  <w:abstractNum w:abstractNumId="7" w15:restartNumberingAfterBreak="0">
     <w:nsid w:val="2D695356"/>
     <w:multiLevelType w:val="hybridMultilevel"/>
     <w:tmpl w:val="27509F44"/>
@@ -8360,7 +8286,7 @@
       </w:pPr>
     </w:lvl>
   </w:abstractNum>
-  <w:abstractNum w:abstractNumId="8">
+  <w:abstractNum w:abstractNumId="8" w15:restartNumberingAfterBreak="0">
     <w:nsid w:val="2F4116EC"/>
     <w:multiLevelType w:val="hybridMultilevel"/>
     <w:tmpl w:val="5DB66E32"/>
@@ -8473,7 +8399,7 @@
       </w:rPr>
     </w:lvl>
   </w:abstractNum>
-  <w:abstractNum w:abstractNumId="9">
+  <w:abstractNum w:abstractNumId="9" w15:restartNumberingAfterBreak="0">
     <w:nsid w:val="321F7F52"/>
     <w:multiLevelType w:val="hybridMultilevel"/>
     <w:tmpl w:val="0016B0A0"/>
@@ -8586,7 +8512,7 @@
       </w:rPr>
     </w:lvl>
   </w:abstractNum>
-  <w:abstractNum w:abstractNumId="10">
+  <w:abstractNum w:abstractNumId="10" w15:restartNumberingAfterBreak="0">
     <w:nsid w:val="36187DAE"/>
     <w:multiLevelType w:val="hybridMultilevel"/>
     <w:tmpl w:val="949EDA54"/>
@@ -8675,7 +8601,7 @@
       </w:pPr>
     </w:lvl>
   </w:abstractNum>
-  <w:abstractNum w:abstractNumId="11">
+  <w:abstractNum w:abstractNumId="11" w15:restartNumberingAfterBreak="0">
     <w:nsid w:val="364662FB"/>
     <w:multiLevelType w:val="hybridMultilevel"/>
     <w:tmpl w:val="04E2B7A8"/>
@@ -8767,7 +8693,7 @@
       </w:pPr>
     </w:lvl>
   </w:abstractNum>
-  <w:abstractNum w:abstractNumId="12">
+  <w:abstractNum w:abstractNumId="12" w15:restartNumberingAfterBreak="0">
     <w:nsid w:val="3CB7706A"/>
     <w:multiLevelType w:val="hybridMultilevel"/>
     <w:tmpl w:val="A142E5C0"/>
@@ -8880,7 +8806,7 @@
       </w:rPr>
     </w:lvl>
   </w:abstractNum>
-  <w:abstractNum w:abstractNumId="13">
+  <w:abstractNum w:abstractNumId="13" w15:restartNumberingAfterBreak="0">
     <w:nsid w:val="3CC63B99"/>
     <w:multiLevelType w:val="hybridMultilevel"/>
     <w:tmpl w:val="1748ACD4"/>
@@ -8966,7 +8892,7 @@
       </w:pPr>
     </w:lvl>
   </w:abstractNum>
-  <w:abstractNum w:abstractNumId="14">
+  <w:abstractNum w:abstractNumId="14" w15:restartNumberingAfterBreak="0">
     <w:nsid w:val="445A61E6"/>
     <w:multiLevelType w:val="hybridMultilevel"/>
     <w:tmpl w:val="188ABF98"/>
@@ -9079,7 +9005,7 @@
       </w:rPr>
     </w:lvl>
   </w:abstractNum>
-  <w:abstractNum w:abstractNumId="15">
+  <w:abstractNum w:abstractNumId="15" w15:restartNumberingAfterBreak="0">
     <w:nsid w:val="48CE4A41"/>
     <w:multiLevelType w:val="hybridMultilevel"/>
     <w:tmpl w:val="8DF22902"/>
@@ -9192,7 +9118,7 @@
       </w:rPr>
     </w:lvl>
   </w:abstractNum>
-  <w:abstractNum w:abstractNumId="16">
+  <w:abstractNum w:abstractNumId="16" w15:restartNumberingAfterBreak="0">
     <w:nsid w:val="4EAC611B"/>
     <w:multiLevelType w:val="hybridMultilevel"/>
     <w:tmpl w:val="905C8FDC"/>
@@ -9281,7 +9207,7 @@
       </w:pPr>
     </w:lvl>
   </w:abstractNum>
-  <w:abstractNum w:abstractNumId="17">
+  <w:abstractNum w:abstractNumId="17" w15:restartNumberingAfterBreak="0">
     <w:nsid w:val="4ECE6A8C"/>
     <w:multiLevelType w:val="hybridMultilevel"/>
     <w:tmpl w:val="A3DA7EAE"/>
@@ -9394,7 +9320,7 @@
       </w:rPr>
     </w:lvl>
   </w:abstractNum>
-  <w:abstractNum w:abstractNumId="18">
+  <w:abstractNum w:abstractNumId="18" w15:restartNumberingAfterBreak="0">
     <w:nsid w:val="5163195F"/>
     <w:multiLevelType w:val="hybridMultilevel"/>
     <w:tmpl w:val="CA9A079C"/>
@@ -9483,7 +9409,7 @@
       </w:pPr>
     </w:lvl>
   </w:abstractNum>
-  <w:abstractNum w:abstractNumId="19">
+  <w:abstractNum w:abstractNumId="19" w15:restartNumberingAfterBreak="0">
     <w:nsid w:val="517B1845"/>
     <w:multiLevelType w:val="hybridMultilevel"/>
     <w:tmpl w:val="73E2300E"/>
@@ -9596,7 +9522,7 @@
       </w:rPr>
     </w:lvl>
   </w:abstractNum>
-  <w:abstractNum w:abstractNumId="20">
+  <w:abstractNum w:abstractNumId="20" w15:restartNumberingAfterBreak="0">
     <w:nsid w:val="536D321E"/>
     <w:multiLevelType w:val="hybridMultilevel"/>
     <w:tmpl w:val="B396FD76"/>
@@ -9709,7 +9635,7 @@
       </w:rPr>
     </w:lvl>
   </w:abstractNum>
-  <w:abstractNum w:abstractNumId="21">
+  <w:abstractNum w:abstractNumId="21" w15:restartNumberingAfterBreak="0">
     <w:nsid w:val="5E106381"/>
     <w:multiLevelType w:val="hybridMultilevel"/>
     <w:tmpl w:val="CCEAD972"/>
@@ -9798,7 +9724,7 @@
       </w:pPr>
     </w:lvl>
   </w:abstractNum>
-  <w:abstractNum w:abstractNumId="22">
+  <w:abstractNum w:abstractNumId="22" w15:restartNumberingAfterBreak="0">
     <w:nsid w:val="641953C1"/>
     <w:multiLevelType w:val="hybridMultilevel"/>
     <w:tmpl w:val="B9F6876C"/>
@@ -9911,7 +9837,7 @@
       </w:rPr>
     </w:lvl>
   </w:abstractNum>
-  <w:abstractNum w:abstractNumId="23">
+  <w:abstractNum w:abstractNumId="23" w15:restartNumberingAfterBreak="0">
     <w:nsid w:val="680850D2"/>
     <w:multiLevelType w:val="hybridMultilevel"/>
     <w:tmpl w:val="391AF31C"/>
@@ -10024,7 +9950,7 @@
       </w:rPr>
     </w:lvl>
   </w:abstractNum>
-  <w:abstractNum w:abstractNumId="24">
+  <w:abstractNum w:abstractNumId="24" w15:restartNumberingAfterBreak="0">
     <w:nsid w:val="695B1FC5"/>
     <w:multiLevelType w:val="hybridMultilevel"/>
     <w:tmpl w:val="7688B7E4"/>
@@ -10137,7 +10063,7 @@
       </w:rPr>
     </w:lvl>
   </w:abstractNum>
-  <w:abstractNum w:abstractNumId="25">
+  <w:abstractNum w:abstractNumId="25" w15:restartNumberingAfterBreak="0">
     <w:nsid w:val="6D076F2B"/>
     <w:multiLevelType w:val="hybridMultilevel"/>
     <w:tmpl w:val="4D54ED9C"/>
@@ -10250,7 +10176,7 @@
       </w:rPr>
     </w:lvl>
   </w:abstractNum>
-  <w:abstractNum w:abstractNumId="26">
+  <w:abstractNum w:abstractNumId="26" w15:restartNumberingAfterBreak="0">
     <w:nsid w:val="6E3F2B2F"/>
     <w:multiLevelType w:val="hybridMultilevel"/>
     <w:tmpl w:val="AD041594"/>
@@ -10363,7 +10289,7 @@
       </w:rPr>
     </w:lvl>
   </w:abstractNum>
-  <w:abstractNum w:abstractNumId="27">
+  <w:abstractNum w:abstractNumId="27" w15:restartNumberingAfterBreak="0">
     <w:nsid w:val="746345B1"/>
     <w:multiLevelType w:val="hybridMultilevel"/>
     <w:tmpl w:val="22568D92"/>
@@ -10452,7 +10378,7 @@
       </w:pPr>
     </w:lvl>
   </w:abstractNum>
-  <w:abstractNum w:abstractNumId="28">
+  <w:abstractNum w:abstractNumId="28" w15:restartNumberingAfterBreak="0">
     <w:nsid w:val="755C1C22"/>
     <w:multiLevelType w:val="hybridMultilevel"/>
     <w:tmpl w:val="977E29A6"/>
@@ -10656,7 +10582,7 @@
 </file>
 
 <file path=word/styles.xml><?xml version="1.0" encoding="utf-8"?>
-<w:styles xmlns:mc="http://schemas.openxmlformats.org/markup-compatibility/2006" xmlns:r="http://schemas.openxmlformats.org/officeDocument/2006/relationships" xmlns:w="http://schemas.openxmlformats.org/wordprocessingml/2006/main" xmlns:w14="http://schemas.microsoft.com/office/word/2010/wordml" xmlns:w15="http://schemas.microsoft.com/office/word/2012/wordml" mc:Ignorable="w14 w15">
+<w:styles xmlns:mc="http://schemas.openxmlformats.org/markup-compatibility/2006" xmlns:r="http://schemas.openxmlformats.org/officeDocument/2006/relationships" xmlns:w="http://schemas.openxmlformats.org/wordprocessingml/2006/main" xmlns:w14="http://schemas.microsoft.com/office/word/2010/wordml" xmlns:w15="http://schemas.microsoft.com/office/word/2012/wordml" xmlns:w16cex="http://schemas.microsoft.com/office/word/2018/wordml/cex" xmlns:w16cid="http://schemas.microsoft.com/office/word/2016/wordml/cid" xmlns:w16="http://schemas.microsoft.com/office/word/2018/wordml" xmlns:w16sdtdh="http://schemas.microsoft.com/office/word/2020/wordml/sdtdatahash" xmlns:w16se="http://schemas.microsoft.com/office/word/2015/wordml/symex" mc:Ignorable="w14 w15 w16se w16cid w16 w16cex w16sdtdh">
   <w:docDefaults>
     <w:rPrDefault>
       <w:rPr>
@@ -10672,7 +10598,7 @@
       </w:pPr>
     </w:pPrDefault>
   </w:docDefaults>
-  <w:latentStyles w:defLockedState="0" w:defUIPriority="99" w:defSemiHidden="0" w:defUnhideWhenUsed="0" w:defQFormat="0" w:count="371">
+  <w:latentStyles w:defLockedState="0" w:defUIPriority="99" w:defSemiHidden="0" w:defUnhideWhenUsed="0" w:defQFormat="0" w:count="376">
     <w:lsdException w:name="Normal" w:uiPriority="0" w:qFormat="1"/>
     <w:lsdException w:name="heading 1" w:uiPriority="9" w:qFormat="1"/>
     <w:lsdException w:name="heading 2" w:semiHidden="1" w:uiPriority="9" w:unhideWhenUsed="1" w:qFormat="1"/>
@@ -10778,7 +10704,6 @@
     <w:lsdException w:name="HTML Sample" w:semiHidden="1" w:unhideWhenUsed="1"/>
     <w:lsdException w:name="HTML Typewriter" w:semiHidden="1" w:unhideWhenUsed="1"/>
     <w:lsdException w:name="HTML Variable" w:semiHidden="1" w:unhideWhenUsed="1"/>
-    <w:lsdException w:name="Normal Table" w:semiHidden="1" w:unhideWhenUsed="1"/>
     <w:lsdException w:name="annotation subject" w:semiHidden="1" w:unhideWhenUsed="1"/>
     <w:lsdException w:name="No List" w:semiHidden="1" w:unhideWhenUsed="1"/>
     <w:lsdException w:name="Outline List 1" w:semiHidden="1" w:unhideWhenUsed="1"/>
@@ -10821,11 +10746,8 @@
     <w:lsdException w:name="Table Contemporary" w:semiHidden="1" w:unhideWhenUsed="1"/>
     <w:lsdException w:name="Table Elegant" w:semiHidden="1" w:unhideWhenUsed="1"/>
     <w:lsdException w:name="Table Professional" w:semiHidden="1" w:unhideWhenUsed="1"/>
-    <w:lsdException w:name="Table Subtle 1" w:semiHidden="1" w:unhideWhenUsed="1"/>
     <w:lsdException w:name="Table Subtle 2" w:semiHidden="1" w:unhideWhenUsed="1"/>
     <w:lsdException w:name="Table Web 1" w:semiHidden="1" w:unhideWhenUsed="1"/>
-    <w:lsdException w:name="Table Web 2" w:semiHidden="1" w:unhideWhenUsed="1"/>
-    <w:lsdException w:name="Table Web 3" w:semiHidden="1" w:unhideWhenUsed="1"/>
     <w:lsdException w:name="Balloon Text" w:semiHidden="1" w:unhideWhenUsed="1"/>
     <w:lsdException w:name="Table Grid" w:uiPriority="39"/>
     <w:lsdException w:name="Table Theme" w:semiHidden="1" w:unhideWhenUsed="1"/>
@@ -11044,6 +10966,11 @@
     <w:lsdException w:name="List Table 5 Dark Accent 6" w:uiPriority="50"/>
     <w:lsdException w:name="List Table 6 Colorful Accent 6" w:uiPriority="51"/>
     <w:lsdException w:name="List Table 7 Colorful Accent 6" w:uiPriority="52"/>
+    <w:lsdException w:name="Mention" w:semiHidden="1" w:unhideWhenUsed="1"/>
+    <w:lsdException w:name="Smart Hyperlink" w:semiHidden="1" w:unhideWhenUsed="1"/>
+    <w:lsdException w:name="Hashtag" w:semiHidden="1" w:unhideWhenUsed="1"/>
+    <w:lsdException w:name="Unresolved Mention" w:semiHidden="1" w:unhideWhenUsed="1"/>
+    <w:lsdException w:name="Smart Link" w:semiHidden="1" w:unhideWhenUsed="1"/>
   </w:latentStyles>
   <w:style w:type="paragraph" w:default="1" w:styleId="a">
     <w:name w:val="Normal"/>

</xml_diff>

<commit_message>
UID:lab 3 almost done
</commit_message>
<xml_diff>
--- a/UID/Lab texts/Лабораторная работа №3_ПОИТ.docx
+++ b/UID/Lab texts/Лабораторная работа №3_ПОИТ.docx
@@ -100,7 +100,25 @@
           <w:sz w:val="28"/>
           <w:szCs w:val="28"/>
         </w:rPr>
-        <w:t>составление Use Case</w:t>
+        <w:t xml:space="preserve">составление </w:t>
+      </w:r>
+      <w:proofErr w:type="spellStart"/>
+      <w:r>
+        <w:rPr>
+          <w:rFonts w:ascii="Times New Roman" w:hAnsi="Times New Roman" w:cs="Times New Roman"/>
+          <w:sz w:val="28"/>
+          <w:szCs w:val="28"/>
+        </w:rPr>
+        <w:t>Use</w:t>
+      </w:r>
+      <w:proofErr w:type="spellEnd"/>
+      <w:r>
+        <w:rPr>
+          <w:rFonts w:ascii="Times New Roman" w:hAnsi="Times New Roman" w:cs="Times New Roman"/>
+          <w:sz w:val="28"/>
+          <w:szCs w:val="28"/>
+        </w:rPr>
+        <w:t xml:space="preserve"> Case</w:t>
       </w:r>
       <w:r>
         <w:rPr>
@@ -146,7 +164,17 @@
           <w:sz w:val="28"/>
           <w:szCs w:val="28"/>
         </w:rPr>
-        <w:t>Цель работы:</w:t>
+        <w:t>Цель работы</w:t>
+      </w:r>
+      <w:proofErr w:type="gramStart"/>
+      <w:r>
+        <w:rPr>
+          <w:rFonts w:ascii="Times New Roman" w:hAnsi="Times New Roman" w:cs="Times New Roman"/>
+          <w:b/>
+          <w:sz w:val="28"/>
+          <w:szCs w:val="28"/>
+        </w:rPr>
+        <w:t>:</w:t>
       </w:r>
       <w:r>
         <w:rPr>
@@ -162,7 +190,16 @@
           <w:sz w:val="28"/>
           <w:szCs w:val="28"/>
         </w:rPr>
-        <w:t>Проанализировать целевую аудиторию и выявить её потребности</w:t>
+        <w:t>Проанализировать</w:t>
+      </w:r>
+      <w:proofErr w:type="gramEnd"/>
+      <w:r>
+        <w:rPr>
+          <w:rFonts w:ascii="Times New Roman" w:hAnsi="Times New Roman" w:cs="Times New Roman"/>
+          <w:sz w:val="28"/>
+          <w:szCs w:val="28"/>
+        </w:rPr>
+        <w:t xml:space="preserve"> целевую аудиторию и выявить её потребности</w:t>
       </w:r>
       <w:r>
         <w:rPr>
@@ -188,13 +225,23 @@
         </w:rPr>
         <w:t xml:space="preserve"> </w:t>
       </w:r>
-      <w:r>
-        <w:rPr>
-          <w:rFonts w:ascii="Times New Roman" w:hAnsi="Times New Roman" w:cs="Times New Roman"/>
-          <w:sz w:val="28"/>
-          <w:szCs w:val="28"/>
-        </w:rPr>
-        <w:t>Use Case</w:t>
+      <w:proofErr w:type="spellStart"/>
+      <w:r>
+        <w:rPr>
+          <w:rFonts w:ascii="Times New Roman" w:hAnsi="Times New Roman" w:cs="Times New Roman"/>
+          <w:sz w:val="28"/>
+          <w:szCs w:val="28"/>
+        </w:rPr>
+        <w:t>Use</w:t>
+      </w:r>
+      <w:proofErr w:type="spellEnd"/>
+      <w:r>
+        <w:rPr>
+          <w:rFonts w:ascii="Times New Roman" w:hAnsi="Times New Roman" w:cs="Times New Roman"/>
+          <w:sz w:val="28"/>
+          <w:szCs w:val="28"/>
+        </w:rPr>
+        <w:t xml:space="preserve"> Case</w:t>
       </w:r>
       <w:r>
         <w:rPr>
@@ -380,7 +427,61 @@
           <w:sz w:val="28"/>
           <w:szCs w:val="28"/>
         </w:rPr>
-        <w:t>B2B, или business to business, бизнес для бизнеса, — компания продаёт свой товар или услуги другим компаниям.</w:t>
+        <w:t xml:space="preserve">B2B, или </w:t>
+      </w:r>
+      <w:proofErr w:type="spellStart"/>
+      <w:r>
+        <w:rPr>
+          <w:rFonts w:ascii="Times New Roman" w:hAnsi="Times New Roman" w:cs="Times New Roman"/>
+          <w:sz w:val="28"/>
+          <w:szCs w:val="28"/>
+        </w:rPr>
+        <w:t>business</w:t>
+      </w:r>
+      <w:proofErr w:type="spellEnd"/>
+      <w:r>
+        <w:rPr>
+          <w:rFonts w:ascii="Times New Roman" w:hAnsi="Times New Roman" w:cs="Times New Roman"/>
+          <w:sz w:val="28"/>
+          <w:szCs w:val="28"/>
+        </w:rPr>
+        <w:t xml:space="preserve"> </w:t>
+      </w:r>
+      <w:proofErr w:type="spellStart"/>
+      <w:r>
+        <w:rPr>
+          <w:rFonts w:ascii="Times New Roman" w:hAnsi="Times New Roman" w:cs="Times New Roman"/>
+          <w:sz w:val="28"/>
+          <w:szCs w:val="28"/>
+        </w:rPr>
+        <w:t>to</w:t>
+      </w:r>
+      <w:proofErr w:type="spellEnd"/>
+      <w:r>
+        <w:rPr>
+          <w:rFonts w:ascii="Times New Roman" w:hAnsi="Times New Roman" w:cs="Times New Roman"/>
+          <w:sz w:val="28"/>
+          <w:szCs w:val="28"/>
+        </w:rPr>
+        <w:t xml:space="preserve"> </w:t>
+      </w:r>
+      <w:proofErr w:type="spellStart"/>
+      <w:r>
+        <w:rPr>
+          <w:rFonts w:ascii="Times New Roman" w:hAnsi="Times New Roman" w:cs="Times New Roman"/>
+          <w:sz w:val="28"/>
+          <w:szCs w:val="28"/>
+        </w:rPr>
+        <w:t>business</w:t>
+      </w:r>
+      <w:proofErr w:type="spellEnd"/>
+      <w:r>
+        <w:rPr>
+          <w:rFonts w:ascii="Times New Roman" w:hAnsi="Times New Roman" w:cs="Times New Roman"/>
+          <w:sz w:val="28"/>
+          <w:szCs w:val="28"/>
+        </w:rPr>
+        <w:t>, бизнес для бизнеса, — компания продаёт свой товар или услуги другим компаниям.</w:t>
       </w:r>
     </w:p>
     <w:p>
@@ -405,7 +506,61 @@
           <w:sz w:val="28"/>
           <w:szCs w:val="28"/>
         </w:rPr>
-        <w:t>B2C, или business to customer, потребите</w:t>
+        <w:t xml:space="preserve">B2C, или </w:t>
+      </w:r>
+      <w:proofErr w:type="spellStart"/>
+      <w:r>
+        <w:rPr>
+          <w:rFonts w:ascii="Times New Roman" w:hAnsi="Times New Roman" w:cs="Times New Roman"/>
+          <w:sz w:val="28"/>
+          <w:szCs w:val="28"/>
+        </w:rPr>
+        <w:t>business</w:t>
+      </w:r>
+      <w:proofErr w:type="spellEnd"/>
+      <w:r>
+        <w:rPr>
+          <w:rFonts w:ascii="Times New Roman" w:hAnsi="Times New Roman" w:cs="Times New Roman"/>
+          <w:sz w:val="28"/>
+          <w:szCs w:val="28"/>
+        </w:rPr>
+        <w:t xml:space="preserve"> </w:t>
+      </w:r>
+      <w:proofErr w:type="spellStart"/>
+      <w:r>
+        <w:rPr>
+          <w:rFonts w:ascii="Times New Roman" w:hAnsi="Times New Roman" w:cs="Times New Roman"/>
+          <w:sz w:val="28"/>
+          <w:szCs w:val="28"/>
+        </w:rPr>
+        <w:t>to</w:t>
+      </w:r>
+      <w:proofErr w:type="spellEnd"/>
+      <w:r>
+        <w:rPr>
+          <w:rFonts w:ascii="Times New Roman" w:hAnsi="Times New Roman" w:cs="Times New Roman"/>
+          <w:sz w:val="28"/>
+          <w:szCs w:val="28"/>
+        </w:rPr>
+        <w:t xml:space="preserve"> </w:t>
+      </w:r>
+      <w:proofErr w:type="spellStart"/>
+      <w:r>
+        <w:rPr>
+          <w:rFonts w:ascii="Times New Roman" w:hAnsi="Times New Roman" w:cs="Times New Roman"/>
+          <w:sz w:val="28"/>
+          <w:szCs w:val="28"/>
+        </w:rPr>
+        <w:t>customer</w:t>
+      </w:r>
+      <w:proofErr w:type="spellEnd"/>
+      <w:r>
+        <w:rPr>
+          <w:rFonts w:ascii="Times New Roman" w:hAnsi="Times New Roman" w:cs="Times New Roman"/>
+          <w:sz w:val="28"/>
+          <w:szCs w:val="28"/>
+        </w:rPr>
+        <w:t>, потребите</w:t>
       </w:r>
       <w:r>
         <w:rPr>
@@ -761,7 +916,29 @@
           <w:szCs w:val="28"/>
           <w:shd w:val="clear" w:color="auto" w:fill="FFFFFF"/>
         </w:rPr>
-        <w:t xml:space="preserve">ность в описанных преимуществах (это можно сделать проанализировав аудиторию, на которую нацелены конкуренты). </w:t>
+        <w:t xml:space="preserve">ность в описанных преимуществах (это </w:t>
+      </w:r>
+      <w:proofErr w:type="gramStart"/>
+      <w:r>
+        <w:rPr>
+          <w:rFonts w:ascii="Times New Roman" w:hAnsi="Times New Roman" w:cs="Times New Roman"/>
+          <w:color w:val="000000"/>
+          <w:sz w:val="28"/>
+          <w:szCs w:val="28"/>
+          <w:shd w:val="clear" w:color="auto" w:fill="FFFFFF"/>
+        </w:rPr>
+        <w:t>можно сделать</w:t>
+      </w:r>
+      <w:proofErr w:type="gramEnd"/>
+      <w:r>
+        <w:rPr>
+          <w:rFonts w:ascii="Times New Roman" w:hAnsi="Times New Roman" w:cs="Times New Roman"/>
+          <w:color w:val="000000"/>
+          <w:sz w:val="28"/>
+          <w:szCs w:val="28"/>
+          <w:shd w:val="clear" w:color="auto" w:fill="FFFFFF"/>
+        </w:rPr>
+        <w:t xml:space="preserve"> проанализировав аудиторию, на которую нацелены конкуренты). </w:t>
       </w:r>
     </w:p>
     <w:p>
@@ -1100,7 +1277,29 @@
           <w:szCs w:val="28"/>
           <w:shd w:val="clear" w:color="auto" w:fill="FFFFFF"/>
         </w:rPr>
-        <w:t xml:space="preserve">исследовать психографию пользователей. То </w:t>
+        <w:t xml:space="preserve">исследовать </w:t>
+      </w:r>
+      <w:proofErr w:type="spellStart"/>
+      <w:r>
+        <w:rPr>
+          <w:rFonts w:ascii="Times New Roman" w:hAnsi="Times New Roman" w:cs="Times New Roman"/>
+          <w:color w:val="000000"/>
+          <w:sz w:val="28"/>
+          <w:szCs w:val="28"/>
+          <w:shd w:val="clear" w:color="auto" w:fill="FFFFFF"/>
+        </w:rPr>
+        <w:t>психографию</w:t>
+      </w:r>
+      <w:proofErr w:type="spellEnd"/>
+      <w:r>
+        <w:rPr>
+          <w:rFonts w:ascii="Times New Roman" w:hAnsi="Times New Roman" w:cs="Times New Roman"/>
+          <w:color w:val="000000"/>
+          <w:sz w:val="28"/>
+          <w:szCs w:val="28"/>
+          <w:shd w:val="clear" w:color="auto" w:fill="FFFFFF"/>
+        </w:rPr>
+        <w:t xml:space="preserve"> пользователей. То </w:t>
       </w:r>
       <w:r>
         <w:rPr>
@@ -2625,7 +2824,75 @@
           <w:sz w:val="28"/>
           <w:szCs w:val="28"/>
         </w:rPr>
-        <w:t xml:space="preserve"> — это короткая история с описанием возможных вариантов применения продукта.</w:t>
+        <w:t xml:space="preserve"> — это короткая история с описанием возможных </w:t>
+      </w:r>
+      <w:proofErr w:type="spellStart"/>
+      <w:r>
+        <w:rPr>
+          <w:rFonts w:ascii="Times New Roman" w:hAnsi="Times New Roman" w:cs="Times New Roman"/>
+          <w:sz w:val="28"/>
+          <w:szCs w:val="28"/>
+        </w:rPr>
+        <w:t>вариан</w:t>
+      </w:r>
+      <w:proofErr w:type="spellEnd"/>
+      <w:r>
+        <w:rPr>
+          <w:rFonts w:ascii="Times New Roman" w:hAnsi="Times New Roman" w:cs="Times New Roman"/>
+          <w:sz w:val="28"/>
+          <w:szCs w:val="28"/>
+        </w:rPr>
+        <w:tab/>
+      </w:r>
+      <w:r>
+        <w:rPr>
+          <w:rFonts w:ascii="Times New Roman" w:hAnsi="Times New Roman" w:cs="Times New Roman"/>
+          <w:sz w:val="28"/>
+          <w:szCs w:val="28"/>
+        </w:rPr>
+        <w:tab/>
+      </w:r>
+      <w:r>
+        <w:rPr>
+          <w:rFonts w:ascii="Times New Roman" w:hAnsi="Times New Roman" w:cs="Times New Roman"/>
+          <w:sz w:val="28"/>
+          <w:szCs w:val="28"/>
+        </w:rPr>
+        <w:tab/>
+      </w:r>
+      <w:r>
+        <w:rPr>
+          <w:rFonts w:ascii="Times New Roman" w:hAnsi="Times New Roman" w:cs="Times New Roman"/>
+          <w:sz w:val="28"/>
+          <w:szCs w:val="28"/>
+        </w:rPr>
+        <w:tab/>
+      </w:r>
+      <w:r>
+        <w:rPr>
+          <w:rFonts w:ascii="Times New Roman" w:hAnsi="Times New Roman" w:cs="Times New Roman"/>
+          <w:sz w:val="28"/>
+          <w:szCs w:val="28"/>
+        </w:rPr>
+        <w:tab/>
+      </w:r>
+      <w:proofErr w:type="spellStart"/>
+      <w:r>
+        <w:rPr>
+          <w:rFonts w:ascii="Times New Roman" w:hAnsi="Times New Roman" w:cs="Times New Roman"/>
+          <w:sz w:val="28"/>
+          <w:szCs w:val="28"/>
+        </w:rPr>
+        <w:t>тов</w:t>
+      </w:r>
+      <w:proofErr w:type="spellEnd"/>
+      <w:r>
+        <w:rPr>
+          <w:rFonts w:ascii="Times New Roman" w:hAnsi="Times New Roman" w:cs="Times New Roman"/>
+          <w:sz w:val="28"/>
+          <w:szCs w:val="28"/>
+        </w:rPr>
+        <w:t xml:space="preserve"> применения продукта.</w:t>
       </w:r>
       <w:r>
         <w:rPr>
@@ -3303,7 +3570,43 @@
           <w:sz w:val="28"/>
           <w:szCs w:val="28"/>
         </w:rPr>
-        <w:t xml:space="preserve">Каждый Use Case представляет собой последовательность простых шагов, которые пользователь должен пройти, чтобы достичь цели. В большинстве случаев Use Case описывает, что делает продукт, а не как он это делает. </w:t>
+        <w:t xml:space="preserve">Каждый </w:t>
+      </w:r>
+      <w:proofErr w:type="spellStart"/>
+      <w:r>
+        <w:rPr>
+          <w:rFonts w:ascii="Times New Roman" w:hAnsi="Times New Roman" w:cs="Times New Roman"/>
+          <w:sz w:val="28"/>
+          <w:szCs w:val="28"/>
+        </w:rPr>
+        <w:t>Use</w:t>
+      </w:r>
+      <w:proofErr w:type="spellEnd"/>
+      <w:r>
+        <w:rPr>
+          <w:rFonts w:ascii="Times New Roman" w:hAnsi="Times New Roman" w:cs="Times New Roman"/>
+          <w:sz w:val="28"/>
+          <w:szCs w:val="28"/>
+        </w:rPr>
+        <w:t xml:space="preserve"> Case представляет собой последовательность простых шагов, которые пользователь должен пройти, чтобы достичь цели. В большинстве случаев </w:t>
+      </w:r>
+      <w:proofErr w:type="spellStart"/>
+      <w:r>
+        <w:rPr>
+          <w:rFonts w:ascii="Times New Roman" w:hAnsi="Times New Roman" w:cs="Times New Roman"/>
+          <w:sz w:val="28"/>
+          <w:szCs w:val="28"/>
+        </w:rPr>
+        <w:t>Use</w:t>
+      </w:r>
+      <w:proofErr w:type="spellEnd"/>
+      <w:r>
+        <w:rPr>
+          <w:rFonts w:ascii="Times New Roman" w:hAnsi="Times New Roman" w:cs="Times New Roman"/>
+          <w:sz w:val="28"/>
+          <w:szCs w:val="28"/>
+        </w:rPr>
+        <w:t xml:space="preserve"> Case описывает, что делает продукт, а не как он это делает. </w:t>
       </w:r>
     </w:p>
     <w:p>
@@ -3320,13 +3623,23 @@
           <w:szCs w:val="28"/>
         </w:rPr>
       </w:pPr>
-      <w:r>
-        <w:rPr>
-          <w:rFonts w:ascii="Times New Roman" w:hAnsi="Times New Roman" w:cs="Times New Roman"/>
-          <w:sz w:val="28"/>
-          <w:szCs w:val="28"/>
-        </w:rPr>
-        <w:t>Use Case можно дополнять визуальной составляющей</w:t>
+      <w:proofErr w:type="spellStart"/>
+      <w:r>
+        <w:rPr>
+          <w:rFonts w:ascii="Times New Roman" w:hAnsi="Times New Roman" w:cs="Times New Roman"/>
+          <w:sz w:val="28"/>
+          <w:szCs w:val="28"/>
+        </w:rPr>
+        <w:t>Use</w:t>
+      </w:r>
+      <w:proofErr w:type="spellEnd"/>
+      <w:r>
+        <w:rPr>
+          <w:rFonts w:ascii="Times New Roman" w:hAnsi="Times New Roman" w:cs="Times New Roman"/>
+          <w:sz w:val="28"/>
+          <w:szCs w:val="28"/>
+        </w:rPr>
+        <w:t xml:space="preserve"> Case можно дополнять визуальной составляющей</w:t>
       </w:r>
       <w:r>
         <w:rPr>
@@ -3384,13 +3697,23 @@
         </w:rPr>
         <w:t xml:space="preserve">для самых распространённых персонажей. </w:t>
       </w:r>
-      <w:r>
-        <w:rPr>
-          <w:rFonts w:ascii="Times New Roman" w:hAnsi="Times New Roman" w:cs="Times New Roman"/>
-          <w:sz w:val="28"/>
-          <w:szCs w:val="28"/>
-        </w:rPr>
-        <w:t>Use Case должен сосредотачиваться не только на взаимодействии с продуктом, но и на других вещах, которые происходят во время этого взаимодействия</w:t>
+      <w:proofErr w:type="spellStart"/>
+      <w:r>
+        <w:rPr>
+          <w:rFonts w:ascii="Times New Roman" w:hAnsi="Times New Roman" w:cs="Times New Roman"/>
+          <w:sz w:val="28"/>
+          <w:szCs w:val="28"/>
+        </w:rPr>
+        <w:t>Use</w:t>
+      </w:r>
+      <w:proofErr w:type="spellEnd"/>
+      <w:r>
+        <w:rPr>
+          <w:rFonts w:ascii="Times New Roman" w:hAnsi="Times New Roman" w:cs="Times New Roman"/>
+          <w:sz w:val="28"/>
+          <w:szCs w:val="28"/>
+        </w:rPr>
+        <w:t xml:space="preserve"> Case должен сосредотачиваться не только на взаимодействии с продуктом, но и на других вещах, которые происходят во время этого взаимодействия</w:t>
       </w:r>
       <w:r>
         <w:rPr>
@@ -3504,7 +3827,25 @@
           <w:sz w:val="28"/>
           <w:szCs w:val="28"/>
         </w:rPr>
-        <w:t>Название (Name) — название Use Case: короткое, понятное, отражающее суть.</w:t>
+        <w:t xml:space="preserve">Название (Name) — название </w:t>
+      </w:r>
+      <w:proofErr w:type="spellStart"/>
+      <w:r>
+        <w:rPr>
+          <w:rFonts w:ascii="Times New Roman" w:hAnsi="Times New Roman" w:cs="Times New Roman"/>
+          <w:sz w:val="28"/>
+          <w:szCs w:val="28"/>
+        </w:rPr>
+        <w:t>Use</w:t>
+      </w:r>
+      <w:proofErr w:type="spellEnd"/>
+      <w:r>
+        <w:rPr>
+          <w:rFonts w:ascii="Times New Roman" w:hAnsi="Times New Roman" w:cs="Times New Roman"/>
+          <w:sz w:val="28"/>
+          <w:szCs w:val="28"/>
+        </w:rPr>
+        <w:t xml:space="preserve"> Case: короткое, понятное, отражающее суть.</w:t>
       </w:r>
     </w:p>
     <w:p>
@@ -3532,7 +3873,61 @@
           <w:sz w:val="28"/>
           <w:szCs w:val="28"/>
         </w:rPr>
-        <w:t>Краткое описание (Brief Description) — текст, описывающий данный Use Case.</w:t>
+        <w:t>Краткое описание (</w:t>
+      </w:r>
+      <w:proofErr w:type="spellStart"/>
+      <w:r>
+        <w:rPr>
+          <w:rFonts w:ascii="Times New Roman" w:hAnsi="Times New Roman" w:cs="Times New Roman"/>
+          <w:sz w:val="28"/>
+          <w:szCs w:val="28"/>
+        </w:rPr>
+        <w:t>Brief</w:t>
+      </w:r>
+      <w:proofErr w:type="spellEnd"/>
+      <w:r>
+        <w:rPr>
+          <w:rFonts w:ascii="Times New Roman" w:hAnsi="Times New Roman" w:cs="Times New Roman"/>
+          <w:sz w:val="28"/>
+          <w:szCs w:val="28"/>
+        </w:rPr>
+        <w:t xml:space="preserve"> </w:t>
+      </w:r>
+      <w:proofErr w:type="spellStart"/>
+      <w:r>
+        <w:rPr>
+          <w:rFonts w:ascii="Times New Roman" w:hAnsi="Times New Roman" w:cs="Times New Roman"/>
+          <w:sz w:val="28"/>
+          <w:szCs w:val="28"/>
+        </w:rPr>
+        <w:t>Description</w:t>
+      </w:r>
+      <w:proofErr w:type="spellEnd"/>
+      <w:r>
+        <w:rPr>
+          <w:rFonts w:ascii="Times New Roman" w:hAnsi="Times New Roman" w:cs="Times New Roman"/>
+          <w:sz w:val="28"/>
+          <w:szCs w:val="28"/>
+        </w:rPr>
+        <w:t xml:space="preserve">) — текст, описывающий данный </w:t>
+      </w:r>
+      <w:proofErr w:type="spellStart"/>
+      <w:r>
+        <w:rPr>
+          <w:rFonts w:ascii="Times New Roman" w:hAnsi="Times New Roman" w:cs="Times New Roman"/>
+          <w:sz w:val="28"/>
+          <w:szCs w:val="28"/>
+        </w:rPr>
+        <w:t>Use</w:t>
+      </w:r>
+      <w:proofErr w:type="spellEnd"/>
+      <w:r>
+        <w:rPr>
+          <w:rFonts w:ascii="Times New Roman" w:hAnsi="Times New Roman" w:cs="Times New Roman"/>
+          <w:sz w:val="28"/>
+          <w:szCs w:val="28"/>
+        </w:rPr>
+        <w:t xml:space="preserve"> Case.</w:t>
       </w:r>
     </w:p>
     <w:p>
@@ -3560,7 +3955,25 @@
           <w:sz w:val="28"/>
           <w:szCs w:val="28"/>
         </w:rPr>
-        <w:t>Участники (Actors) — список участников взаимодействия. Часто состоит из одного человека.</w:t>
+        <w:t>Участники (</w:t>
+      </w:r>
+      <w:proofErr w:type="spellStart"/>
+      <w:r>
+        <w:rPr>
+          <w:rFonts w:ascii="Times New Roman" w:hAnsi="Times New Roman" w:cs="Times New Roman"/>
+          <w:sz w:val="28"/>
+          <w:szCs w:val="28"/>
+        </w:rPr>
+        <w:t>Actors</w:t>
+      </w:r>
+      <w:proofErr w:type="spellEnd"/>
+      <w:r>
+        <w:rPr>
+          <w:rFonts w:ascii="Times New Roman" w:hAnsi="Times New Roman" w:cs="Times New Roman"/>
+          <w:sz w:val="28"/>
+          <w:szCs w:val="28"/>
+        </w:rPr>
+        <w:t>) — список участников взаимодействия. Часто состоит из одного человека.</w:t>
       </w:r>
     </w:p>
     <w:p>
@@ -3588,7 +4001,43 @@
           <w:sz w:val="28"/>
           <w:szCs w:val="28"/>
         </w:rPr>
-        <w:t>Предусловия (Preconditions) — условия, которые должны быть выполнены перед началом реализации данного Use Case.</w:t>
+        <w:t>Предусловия (</w:t>
+      </w:r>
+      <w:proofErr w:type="spellStart"/>
+      <w:r>
+        <w:rPr>
+          <w:rFonts w:ascii="Times New Roman" w:hAnsi="Times New Roman" w:cs="Times New Roman"/>
+          <w:sz w:val="28"/>
+          <w:szCs w:val="28"/>
+        </w:rPr>
+        <w:t>Preconditions</w:t>
+      </w:r>
+      <w:proofErr w:type="spellEnd"/>
+      <w:r>
+        <w:rPr>
+          <w:rFonts w:ascii="Times New Roman" w:hAnsi="Times New Roman" w:cs="Times New Roman"/>
+          <w:sz w:val="28"/>
+          <w:szCs w:val="28"/>
+        </w:rPr>
+        <w:t xml:space="preserve">) — условия, которые должны быть выполнены перед началом реализации данного </w:t>
+      </w:r>
+      <w:proofErr w:type="spellStart"/>
+      <w:r>
+        <w:rPr>
+          <w:rFonts w:ascii="Times New Roman" w:hAnsi="Times New Roman" w:cs="Times New Roman"/>
+          <w:sz w:val="28"/>
+          <w:szCs w:val="28"/>
+        </w:rPr>
+        <w:t>Use</w:t>
+      </w:r>
+      <w:proofErr w:type="spellEnd"/>
+      <w:r>
+        <w:rPr>
+          <w:rFonts w:ascii="Times New Roman" w:hAnsi="Times New Roman" w:cs="Times New Roman"/>
+          <w:sz w:val="28"/>
+          <w:szCs w:val="28"/>
+        </w:rPr>
+        <w:t xml:space="preserve"> Case.</w:t>
       </w:r>
     </w:p>
     <w:p>
@@ -3616,7 +4065,43 @@
           <w:sz w:val="28"/>
           <w:szCs w:val="28"/>
         </w:rPr>
-        <w:t>Триггер (Trigger) — событие или условие, которое заставляет пользователя приступить к выполнению Use Case. Тут может быть описан контекст использования (Где? Когда?), а также мотивация и причины.</w:t>
+        <w:t>Триггер (</w:t>
+      </w:r>
+      <w:proofErr w:type="spellStart"/>
+      <w:r>
+        <w:rPr>
+          <w:rFonts w:ascii="Times New Roman" w:hAnsi="Times New Roman" w:cs="Times New Roman"/>
+          <w:sz w:val="28"/>
+          <w:szCs w:val="28"/>
+        </w:rPr>
+        <w:t>Trigger</w:t>
+      </w:r>
+      <w:proofErr w:type="spellEnd"/>
+      <w:r>
+        <w:rPr>
+          <w:rFonts w:ascii="Times New Roman" w:hAnsi="Times New Roman" w:cs="Times New Roman"/>
+          <w:sz w:val="28"/>
+          <w:szCs w:val="28"/>
+        </w:rPr>
+        <w:t xml:space="preserve">) — событие или условие, которое заставляет пользователя приступить к выполнению </w:t>
+      </w:r>
+      <w:proofErr w:type="spellStart"/>
+      <w:r>
+        <w:rPr>
+          <w:rFonts w:ascii="Times New Roman" w:hAnsi="Times New Roman" w:cs="Times New Roman"/>
+          <w:sz w:val="28"/>
+          <w:szCs w:val="28"/>
+        </w:rPr>
+        <w:t>Use</w:t>
+      </w:r>
+      <w:proofErr w:type="spellEnd"/>
+      <w:r>
+        <w:rPr>
+          <w:rFonts w:ascii="Times New Roman" w:hAnsi="Times New Roman" w:cs="Times New Roman"/>
+          <w:sz w:val="28"/>
+          <w:szCs w:val="28"/>
+        </w:rPr>
+        <w:t xml:space="preserve"> Case. Тут может быть описан контекст использования (Где? Когда?), а также мотивация и причины.</w:t>
       </w:r>
     </w:p>
     <w:p>
@@ -3644,7 +4129,25 @@
           <w:sz w:val="28"/>
           <w:szCs w:val="28"/>
         </w:rPr>
-        <w:t xml:space="preserve">Базовый сценарий (Basic Flow) — последовательность действий, которые выполняет участник для успешного достижения цели, то есть сюжет. </w:t>
+        <w:t xml:space="preserve">Базовый сценарий (Basic </w:t>
+      </w:r>
+      <w:proofErr w:type="spellStart"/>
+      <w:r>
+        <w:rPr>
+          <w:rFonts w:ascii="Times New Roman" w:hAnsi="Times New Roman" w:cs="Times New Roman"/>
+          <w:sz w:val="28"/>
+          <w:szCs w:val="28"/>
+        </w:rPr>
+        <w:t>Flow</w:t>
+      </w:r>
+      <w:proofErr w:type="spellEnd"/>
+      <w:r>
+        <w:rPr>
+          <w:rFonts w:ascii="Times New Roman" w:hAnsi="Times New Roman" w:cs="Times New Roman"/>
+          <w:sz w:val="28"/>
+          <w:szCs w:val="28"/>
+        </w:rPr>
+        <w:t xml:space="preserve">) — последовательность действий, которые выполняет участник для успешного достижения цели, то есть сюжет. </w:t>
       </w:r>
     </w:p>
     <w:p>
@@ -3672,7 +4175,61 @@
           <w:sz w:val="28"/>
           <w:szCs w:val="28"/>
         </w:rPr>
-        <w:t>Альтернативные сценарии (Alternative Flows) — описание альтернативных сценариев выполнения Use Case. Важное условие альтернативных сценариев — участник в итоге успешно достигает цели.</w:t>
+        <w:t>Альтернативные сценарии (</w:t>
+      </w:r>
+      <w:proofErr w:type="spellStart"/>
+      <w:r>
+        <w:rPr>
+          <w:rFonts w:ascii="Times New Roman" w:hAnsi="Times New Roman" w:cs="Times New Roman"/>
+          <w:sz w:val="28"/>
+          <w:szCs w:val="28"/>
+        </w:rPr>
+        <w:t>Alternative</w:t>
+      </w:r>
+      <w:proofErr w:type="spellEnd"/>
+      <w:r>
+        <w:rPr>
+          <w:rFonts w:ascii="Times New Roman" w:hAnsi="Times New Roman" w:cs="Times New Roman"/>
+          <w:sz w:val="28"/>
+          <w:szCs w:val="28"/>
+        </w:rPr>
+        <w:t xml:space="preserve"> </w:t>
+      </w:r>
+      <w:proofErr w:type="spellStart"/>
+      <w:r>
+        <w:rPr>
+          <w:rFonts w:ascii="Times New Roman" w:hAnsi="Times New Roman" w:cs="Times New Roman"/>
+          <w:sz w:val="28"/>
+          <w:szCs w:val="28"/>
+        </w:rPr>
+        <w:t>Flows</w:t>
+      </w:r>
+      <w:proofErr w:type="spellEnd"/>
+      <w:r>
+        <w:rPr>
+          <w:rFonts w:ascii="Times New Roman" w:hAnsi="Times New Roman" w:cs="Times New Roman"/>
+          <w:sz w:val="28"/>
+          <w:szCs w:val="28"/>
+        </w:rPr>
+        <w:t xml:space="preserve">) — описание альтернативных сценариев выполнения </w:t>
+      </w:r>
+      <w:proofErr w:type="spellStart"/>
+      <w:r>
+        <w:rPr>
+          <w:rFonts w:ascii="Times New Roman" w:hAnsi="Times New Roman" w:cs="Times New Roman"/>
+          <w:sz w:val="28"/>
+          <w:szCs w:val="28"/>
+        </w:rPr>
+        <w:t>Use</w:t>
+      </w:r>
+      <w:proofErr w:type="spellEnd"/>
+      <w:r>
+        <w:rPr>
+          <w:rFonts w:ascii="Times New Roman" w:hAnsi="Times New Roman" w:cs="Times New Roman"/>
+          <w:sz w:val="28"/>
+          <w:szCs w:val="28"/>
+        </w:rPr>
+        <w:t xml:space="preserve"> Case. Важное условие альтернативных сценариев — участник в итоге успешно достигает цели.</w:t>
       </w:r>
     </w:p>
     <w:p>
@@ -3700,7 +4257,61 @@
           <w:sz w:val="28"/>
           <w:szCs w:val="28"/>
         </w:rPr>
-        <w:t>Исключительные сценарии (Exceptional Flows) — все, что может привести участника к невыполнению Use Case.</w:t>
+        <w:t>Исключительные сценарии (</w:t>
+      </w:r>
+      <w:proofErr w:type="spellStart"/>
+      <w:r>
+        <w:rPr>
+          <w:rFonts w:ascii="Times New Roman" w:hAnsi="Times New Roman" w:cs="Times New Roman"/>
+          <w:sz w:val="28"/>
+          <w:szCs w:val="28"/>
+        </w:rPr>
+        <w:t>Exceptional</w:t>
+      </w:r>
+      <w:proofErr w:type="spellEnd"/>
+      <w:r>
+        <w:rPr>
+          <w:rFonts w:ascii="Times New Roman" w:hAnsi="Times New Roman" w:cs="Times New Roman"/>
+          <w:sz w:val="28"/>
+          <w:szCs w:val="28"/>
+        </w:rPr>
+        <w:t xml:space="preserve"> </w:t>
+      </w:r>
+      <w:proofErr w:type="spellStart"/>
+      <w:r>
+        <w:rPr>
+          <w:rFonts w:ascii="Times New Roman" w:hAnsi="Times New Roman" w:cs="Times New Roman"/>
+          <w:sz w:val="28"/>
+          <w:szCs w:val="28"/>
+        </w:rPr>
+        <w:t>Flows</w:t>
+      </w:r>
+      <w:proofErr w:type="spellEnd"/>
+      <w:r>
+        <w:rPr>
+          <w:rFonts w:ascii="Times New Roman" w:hAnsi="Times New Roman" w:cs="Times New Roman"/>
+          <w:sz w:val="28"/>
+          <w:szCs w:val="28"/>
+        </w:rPr>
+        <w:t xml:space="preserve">) — все, что может привести участника к невыполнению </w:t>
+      </w:r>
+      <w:proofErr w:type="spellStart"/>
+      <w:r>
+        <w:rPr>
+          <w:rFonts w:ascii="Times New Roman" w:hAnsi="Times New Roman" w:cs="Times New Roman"/>
+          <w:sz w:val="28"/>
+          <w:szCs w:val="28"/>
+        </w:rPr>
+        <w:t>Use</w:t>
+      </w:r>
+      <w:proofErr w:type="spellEnd"/>
+      <w:r>
+        <w:rPr>
+          <w:rFonts w:ascii="Times New Roman" w:hAnsi="Times New Roman" w:cs="Times New Roman"/>
+          <w:sz w:val="28"/>
+          <w:szCs w:val="28"/>
+        </w:rPr>
+        <w:t xml:space="preserve"> Case.</w:t>
       </w:r>
     </w:p>
     <w:p>
@@ -3728,7 +4339,43 @@
           <w:sz w:val="28"/>
           <w:szCs w:val="28"/>
         </w:rPr>
-        <w:t>Постусловие (Post Conditions) — результат после выполнения Use Case</w:t>
+        <w:t xml:space="preserve">Постусловие (Post </w:t>
+      </w:r>
+      <w:proofErr w:type="spellStart"/>
+      <w:r>
+        <w:rPr>
+          <w:rFonts w:ascii="Times New Roman" w:hAnsi="Times New Roman" w:cs="Times New Roman"/>
+          <w:sz w:val="28"/>
+          <w:szCs w:val="28"/>
+        </w:rPr>
+        <w:t>Conditions</w:t>
+      </w:r>
+      <w:proofErr w:type="spellEnd"/>
+      <w:r>
+        <w:rPr>
+          <w:rFonts w:ascii="Times New Roman" w:hAnsi="Times New Roman" w:cs="Times New Roman"/>
+          <w:sz w:val="28"/>
+          <w:szCs w:val="28"/>
+        </w:rPr>
+        <w:t xml:space="preserve">) — результат после выполнения </w:t>
+      </w:r>
+      <w:proofErr w:type="spellStart"/>
+      <w:r>
+        <w:rPr>
+          <w:rFonts w:ascii="Times New Roman" w:hAnsi="Times New Roman" w:cs="Times New Roman"/>
+          <w:sz w:val="28"/>
+          <w:szCs w:val="28"/>
+        </w:rPr>
+        <w:t>Use</w:t>
+      </w:r>
+      <w:proofErr w:type="spellEnd"/>
+      <w:r>
+        <w:rPr>
+          <w:rFonts w:ascii="Times New Roman" w:hAnsi="Times New Roman" w:cs="Times New Roman"/>
+          <w:sz w:val="28"/>
+          <w:szCs w:val="28"/>
+        </w:rPr>
+        <w:t xml:space="preserve"> Case</w:t>
       </w:r>
       <w:r>
         <w:rPr>
@@ -4393,13 +5040,149 @@
           <w:szCs w:val="28"/>
         </w:rPr>
       </w:pPr>
-      <w:r>
-        <w:rPr>
-          <w:rFonts w:ascii="Times New Roman" w:hAnsi="Times New Roman" w:cs="Times New Roman"/>
-          <w:sz w:val="28"/>
-          <w:szCs w:val="28"/>
-        </w:rPr>
-        <w:t>Jobs To Be Done — это методология, которая позволяет исследовать потребности людей и создавать полезные продукты. Смысл Jobs To Be Done заключается в том, что при анализе действий пользователя фокусироваться нужно на том, чего он стремится достичь в определённых обстоятельства. Это и называется job to be done — «работа, которую надо выполнить».</w:t>
+      <w:proofErr w:type="spellStart"/>
+      <w:r>
+        <w:rPr>
+          <w:rFonts w:ascii="Times New Roman" w:hAnsi="Times New Roman" w:cs="Times New Roman"/>
+          <w:sz w:val="28"/>
+          <w:szCs w:val="28"/>
+        </w:rPr>
+        <w:t>Jobs</w:t>
+      </w:r>
+      <w:proofErr w:type="spellEnd"/>
+      <w:r>
+        <w:rPr>
+          <w:rFonts w:ascii="Times New Roman" w:hAnsi="Times New Roman" w:cs="Times New Roman"/>
+          <w:sz w:val="28"/>
+          <w:szCs w:val="28"/>
+        </w:rPr>
+        <w:t xml:space="preserve"> To Be </w:t>
+      </w:r>
+      <w:proofErr w:type="spellStart"/>
+      <w:r>
+        <w:rPr>
+          <w:rFonts w:ascii="Times New Roman" w:hAnsi="Times New Roman" w:cs="Times New Roman"/>
+          <w:sz w:val="28"/>
+          <w:szCs w:val="28"/>
+        </w:rPr>
+        <w:t>Done</w:t>
+      </w:r>
+      <w:proofErr w:type="spellEnd"/>
+      <w:r>
+        <w:rPr>
+          <w:rFonts w:ascii="Times New Roman" w:hAnsi="Times New Roman" w:cs="Times New Roman"/>
+          <w:sz w:val="28"/>
+          <w:szCs w:val="28"/>
+        </w:rPr>
+        <w:t xml:space="preserve"> — это методология, которая позволяет исследовать потребности людей и создавать полезные продукты. Смысл </w:t>
+      </w:r>
+      <w:proofErr w:type="spellStart"/>
+      <w:r>
+        <w:rPr>
+          <w:rFonts w:ascii="Times New Roman" w:hAnsi="Times New Roman" w:cs="Times New Roman"/>
+          <w:sz w:val="28"/>
+          <w:szCs w:val="28"/>
+        </w:rPr>
+        <w:t>Jobs</w:t>
+      </w:r>
+      <w:proofErr w:type="spellEnd"/>
+      <w:r>
+        <w:rPr>
+          <w:rFonts w:ascii="Times New Roman" w:hAnsi="Times New Roman" w:cs="Times New Roman"/>
+          <w:sz w:val="28"/>
+          <w:szCs w:val="28"/>
+        </w:rPr>
+        <w:t xml:space="preserve"> To Be </w:t>
+      </w:r>
+      <w:proofErr w:type="spellStart"/>
+      <w:r>
+        <w:rPr>
+          <w:rFonts w:ascii="Times New Roman" w:hAnsi="Times New Roman" w:cs="Times New Roman"/>
+          <w:sz w:val="28"/>
+          <w:szCs w:val="28"/>
+        </w:rPr>
+        <w:t>Done</w:t>
+      </w:r>
+      <w:proofErr w:type="spellEnd"/>
+      <w:r>
+        <w:rPr>
+          <w:rFonts w:ascii="Times New Roman" w:hAnsi="Times New Roman" w:cs="Times New Roman"/>
+          <w:sz w:val="28"/>
+          <w:szCs w:val="28"/>
+        </w:rPr>
+        <w:t xml:space="preserve"> заключается в том, что при анализе действий пользователя фокусироваться нужно на том, чего он стремится достичь в определённых обстоятельства. Это и называется </w:t>
+      </w:r>
+      <w:proofErr w:type="spellStart"/>
+      <w:r>
+        <w:rPr>
+          <w:rFonts w:ascii="Times New Roman" w:hAnsi="Times New Roman" w:cs="Times New Roman"/>
+          <w:sz w:val="28"/>
+          <w:szCs w:val="28"/>
+        </w:rPr>
+        <w:t>job</w:t>
+      </w:r>
+      <w:proofErr w:type="spellEnd"/>
+      <w:r>
+        <w:rPr>
+          <w:rFonts w:ascii="Times New Roman" w:hAnsi="Times New Roman" w:cs="Times New Roman"/>
+          <w:sz w:val="28"/>
+          <w:szCs w:val="28"/>
+        </w:rPr>
+        <w:t xml:space="preserve"> </w:t>
+      </w:r>
+      <w:proofErr w:type="spellStart"/>
+      <w:r>
+        <w:rPr>
+          <w:rFonts w:ascii="Times New Roman" w:hAnsi="Times New Roman" w:cs="Times New Roman"/>
+          <w:sz w:val="28"/>
+          <w:szCs w:val="28"/>
+        </w:rPr>
+        <w:t>to</w:t>
+      </w:r>
+      <w:proofErr w:type="spellEnd"/>
+      <w:r>
+        <w:rPr>
+          <w:rFonts w:ascii="Times New Roman" w:hAnsi="Times New Roman" w:cs="Times New Roman"/>
+          <w:sz w:val="28"/>
+          <w:szCs w:val="28"/>
+        </w:rPr>
+        <w:t xml:space="preserve"> </w:t>
+      </w:r>
+      <w:proofErr w:type="spellStart"/>
+      <w:r>
+        <w:rPr>
+          <w:rFonts w:ascii="Times New Roman" w:hAnsi="Times New Roman" w:cs="Times New Roman"/>
+          <w:sz w:val="28"/>
+          <w:szCs w:val="28"/>
+        </w:rPr>
+        <w:t>be</w:t>
+      </w:r>
+      <w:proofErr w:type="spellEnd"/>
+      <w:r>
+        <w:rPr>
+          <w:rFonts w:ascii="Times New Roman" w:hAnsi="Times New Roman" w:cs="Times New Roman"/>
+          <w:sz w:val="28"/>
+          <w:szCs w:val="28"/>
+        </w:rPr>
+        <w:t xml:space="preserve"> </w:t>
+      </w:r>
+      <w:proofErr w:type="spellStart"/>
+      <w:r>
+        <w:rPr>
+          <w:rFonts w:ascii="Times New Roman" w:hAnsi="Times New Roman" w:cs="Times New Roman"/>
+          <w:sz w:val="28"/>
+          <w:szCs w:val="28"/>
+        </w:rPr>
+        <w:t>done</w:t>
+      </w:r>
+      <w:proofErr w:type="spellEnd"/>
+      <w:r>
+        <w:rPr>
+          <w:rFonts w:ascii="Times New Roman" w:hAnsi="Times New Roman" w:cs="Times New Roman"/>
+          <w:sz w:val="28"/>
+          <w:szCs w:val="28"/>
+        </w:rPr>
+        <w:t xml:space="preserve"> — «работа, которую надо выполнить».</w:t>
       </w:r>
     </w:p>
     <w:p>
@@ -5061,6 +5844,7 @@
         </w:rPr>
         <w:t xml:space="preserve"> появляется новое понятие, </w:t>
       </w:r>
+      <w:proofErr w:type="spellStart"/>
       <w:r>
         <w:rPr>
           <w:rFonts w:ascii="Times New Roman" w:hAnsi="Times New Roman" w:cs="Times New Roman"/>
@@ -5068,8 +5852,29 @@
           <w:sz w:val="28"/>
           <w:szCs w:val="28"/>
         </w:rPr>
-        <w:t>job story</w:t>
-      </w:r>
+        <w:t>job</w:t>
+      </w:r>
+      <w:proofErr w:type="spellEnd"/>
+      <w:r>
+        <w:rPr>
+          <w:rFonts w:ascii="Times New Roman" w:hAnsi="Times New Roman" w:cs="Times New Roman"/>
+          <w:b/>
+          <w:sz w:val="28"/>
+          <w:szCs w:val="28"/>
+        </w:rPr>
+        <w:t xml:space="preserve"> </w:t>
+      </w:r>
+      <w:proofErr w:type="spellStart"/>
+      <w:r>
+        <w:rPr>
+          <w:rFonts w:ascii="Times New Roman" w:hAnsi="Times New Roman" w:cs="Times New Roman"/>
+          <w:b/>
+          <w:sz w:val="28"/>
+          <w:szCs w:val="28"/>
+        </w:rPr>
+        <w:t>story</w:t>
+      </w:r>
+      <w:proofErr w:type="spellEnd"/>
       <w:r>
         <w:rPr>
           <w:rFonts w:ascii="Times New Roman" w:hAnsi="Times New Roman" w:cs="Times New Roman"/>
@@ -5176,6 +5981,7 @@
         </w:rPr>
         <w:t>j</w:t>
       </w:r>
+      <w:proofErr w:type="spellStart"/>
       <w:r>
         <w:rPr>
           <w:rFonts w:ascii="Times New Roman" w:hAnsi="Times New Roman" w:cs="Times New Roman"/>
@@ -5183,18 +5989,29 @@
           <w:sz w:val="28"/>
           <w:szCs w:val="28"/>
         </w:rPr>
-        <w:t xml:space="preserve">ob </w:t>
-      </w:r>
+        <w:t>ob</w:t>
+      </w:r>
+      <w:proofErr w:type="spellEnd"/>
       <w:r>
         <w:rPr>
           <w:rFonts w:ascii="Times New Roman" w:hAnsi="Times New Roman" w:cs="Times New Roman"/>
           <w:b/>
           <w:sz w:val="28"/>
           <w:szCs w:val="28"/>
+        </w:rPr>
+        <w:t xml:space="preserve"> </w:t>
+      </w:r>
+      <w:r>
+        <w:rPr>
+          <w:rFonts w:ascii="Times New Roman" w:hAnsi="Times New Roman" w:cs="Times New Roman"/>
+          <w:b/>
+          <w:sz w:val="28"/>
+          <w:szCs w:val="28"/>
           <w:lang w:val="en-US"/>
         </w:rPr>
         <w:t>s</w:t>
       </w:r>
+      <w:proofErr w:type="spellStart"/>
       <w:r>
         <w:rPr>
           <w:rFonts w:ascii="Times New Roman" w:hAnsi="Times New Roman" w:cs="Times New Roman"/>
@@ -5204,6 +6021,7 @@
         </w:rPr>
         <w:t>tory</w:t>
       </w:r>
+      <w:proofErr w:type="spellEnd"/>
       <w:r>
         <w:rPr>
           <w:rFonts w:ascii="Times New Roman" w:hAnsi="Times New Roman" w:cs="Times New Roman"/>
@@ -7264,14 +8082,34 @@
         </w:rPr>
         <w:t xml:space="preserve">Что такое </w:t>
       </w:r>
-      <w:r>
-        <w:rPr>
-          <w:rFonts w:ascii="Times New Roman" w:hAnsi="Times New Roman" w:cs="Times New Roman"/>
-          <w:sz w:val="28"/>
-          <w:szCs w:val="28"/>
-        </w:rPr>
-        <w:t>job story</w:t>
-      </w:r>
+      <w:proofErr w:type="spellStart"/>
+      <w:r>
+        <w:rPr>
+          <w:rFonts w:ascii="Times New Roman" w:hAnsi="Times New Roman" w:cs="Times New Roman"/>
+          <w:sz w:val="28"/>
+          <w:szCs w:val="28"/>
+        </w:rPr>
+        <w:t>job</w:t>
+      </w:r>
+      <w:proofErr w:type="spellEnd"/>
+      <w:r>
+        <w:rPr>
+          <w:rFonts w:ascii="Times New Roman" w:hAnsi="Times New Roman" w:cs="Times New Roman"/>
+          <w:sz w:val="28"/>
+          <w:szCs w:val="28"/>
+        </w:rPr>
+        <w:t xml:space="preserve"> </w:t>
+      </w:r>
+      <w:proofErr w:type="spellStart"/>
+      <w:r>
+        <w:rPr>
+          <w:rFonts w:ascii="Times New Roman" w:hAnsi="Times New Roman" w:cs="Times New Roman"/>
+          <w:sz w:val="28"/>
+          <w:szCs w:val="28"/>
+        </w:rPr>
+        <w:t>story</w:t>
+      </w:r>
+      <w:proofErr w:type="spellEnd"/>
       <w:r>
         <w:rPr>
           <w:rFonts w:ascii="Times New Roman" w:hAnsi="Times New Roman" w:cs="Times New Roman"/>
@@ -7308,14 +8146,34 @@
         </w:rPr>
         <w:t xml:space="preserve">По какому шаблону составляется </w:t>
       </w:r>
-      <w:r>
-        <w:rPr>
-          <w:rFonts w:ascii="Times New Roman" w:hAnsi="Times New Roman" w:cs="Times New Roman"/>
-          <w:sz w:val="28"/>
-          <w:szCs w:val="28"/>
-        </w:rPr>
-        <w:t>job story</w:t>
-      </w:r>
+      <w:proofErr w:type="spellStart"/>
+      <w:r>
+        <w:rPr>
+          <w:rFonts w:ascii="Times New Roman" w:hAnsi="Times New Roman" w:cs="Times New Roman"/>
+          <w:sz w:val="28"/>
+          <w:szCs w:val="28"/>
+        </w:rPr>
+        <w:t>job</w:t>
+      </w:r>
+      <w:proofErr w:type="spellEnd"/>
+      <w:r>
+        <w:rPr>
+          <w:rFonts w:ascii="Times New Roman" w:hAnsi="Times New Roman" w:cs="Times New Roman"/>
+          <w:sz w:val="28"/>
+          <w:szCs w:val="28"/>
+        </w:rPr>
+        <w:t xml:space="preserve"> </w:t>
+      </w:r>
+      <w:proofErr w:type="spellStart"/>
+      <w:r>
+        <w:rPr>
+          <w:rFonts w:ascii="Times New Roman" w:hAnsi="Times New Roman" w:cs="Times New Roman"/>
+          <w:sz w:val="28"/>
+          <w:szCs w:val="28"/>
+        </w:rPr>
+        <w:t>story</w:t>
+      </w:r>
+      <w:proofErr w:type="spellEnd"/>
       <w:r>
         <w:rPr>
           <w:rFonts w:ascii="Times New Roman" w:hAnsi="Times New Roman" w:cs="Times New Roman"/>
@@ -7352,14 +8210,34 @@
         </w:rPr>
         <w:t xml:space="preserve">Чем </w:t>
       </w:r>
-      <w:r>
-        <w:rPr>
-          <w:rFonts w:ascii="Times New Roman" w:hAnsi="Times New Roman" w:cs="Times New Roman"/>
-          <w:sz w:val="28"/>
-          <w:szCs w:val="28"/>
-        </w:rPr>
-        <w:t>job story</w:t>
-      </w:r>
+      <w:proofErr w:type="spellStart"/>
+      <w:r>
+        <w:rPr>
+          <w:rFonts w:ascii="Times New Roman" w:hAnsi="Times New Roman" w:cs="Times New Roman"/>
+          <w:sz w:val="28"/>
+          <w:szCs w:val="28"/>
+        </w:rPr>
+        <w:t>job</w:t>
+      </w:r>
+      <w:proofErr w:type="spellEnd"/>
+      <w:r>
+        <w:rPr>
+          <w:rFonts w:ascii="Times New Roman" w:hAnsi="Times New Roman" w:cs="Times New Roman"/>
+          <w:sz w:val="28"/>
+          <w:szCs w:val="28"/>
+        </w:rPr>
+        <w:t xml:space="preserve"> </w:t>
+      </w:r>
+      <w:proofErr w:type="spellStart"/>
+      <w:r>
+        <w:rPr>
+          <w:rFonts w:ascii="Times New Roman" w:hAnsi="Times New Roman" w:cs="Times New Roman"/>
+          <w:sz w:val="28"/>
+          <w:szCs w:val="28"/>
+        </w:rPr>
+        <w:t>story</w:t>
+      </w:r>
+      <w:proofErr w:type="spellEnd"/>
       <w:r>
         <w:rPr>
           <w:rFonts w:ascii="Times New Roman" w:hAnsi="Times New Roman" w:cs="Times New Roman"/>
@@ -10704,6 +11582,7 @@
     <w:lsdException w:name="HTML Sample" w:semiHidden="1" w:unhideWhenUsed="1"/>
     <w:lsdException w:name="HTML Typewriter" w:semiHidden="1" w:unhideWhenUsed="1"/>
     <w:lsdException w:name="HTML Variable" w:semiHidden="1" w:unhideWhenUsed="1"/>
+    <w:lsdException w:name="Normal Table" w:semiHidden="1" w:unhideWhenUsed="1"/>
     <w:lsdException w:name="annotation subject" w:semiHidden="1" w:unhideWhenUsed="1"/>
     <w:lsdException w:name="No List" w:semiHidden="1" w:unhideWhenUsed="1"/>
     <w:lsdException w:name="Outline List 1" w:semiHidden="1" w:unhideWhenUsed="1"/>
@@ -10746,8 +11625,11 @@
     <w:lsdException w:name="Table Contemporary" w:semiHidden="1" w:unhideWhenUsed="1"/>
     <w:lsdException w:name="Table Elegant" w:semiHidden="1" w:unhideWhenUsed="1"/>
     <w:lsdException w:name="Table Professional" w:semiHidden="1" w:unhideWhenUsed="1"/>
+    <w:lsdException w:name="Table Subtle 1" w:semiHidden="1" w:unhideWhenUsed="1"/>
     <w:lsdException w:name="Table Subtle 2" w:semiHidden="1" w:unhideWhenUsed="1"/>
     <w:lsdException w:name="Table Web 1" w:semiHidden="1" w:unhideWhenUsed="1"/>
+    <w:lsdException w:name="Table Web 2" w:semiHidden="1" w:unhideWhenUsed="1"/>
+    <w:lsdException w:name="Table Web 3" w:semiHidden="1" w:unhideWhenUsed="1"/>
     <w:lsdException w:name="Balloon Text" w:semiHidden="1" w:unhideWhenUsed="1"/>
     <w:lsdException w:name="Table Grid" w:uiPriority="39"/>
     <w:lsdException w:name="Table Theme" w:semiHidden="1" w:unhideWhenUsed="1"/>

</xml_diff>

<commit_message>
UID:lab3 done, OOP:lab4-5 in progress. Buy button fixed. More button in progress
</commit_message>
<xml_diff>
--- a/UID/Lab texts/Лабораторная работа №3_ПОИТ.docx
+++ b/UID/Lab texts/Лабораторная работа №3_ПОИТ.docx
@@ -164,17 +164,7 @@
           <w:sz w:val="28"/>
           <w:szCs w:val="28"/>
         </w:rPr>
-        <w:t>Цель работы</w:t>
-      </w:r>
-      <w:proofErr w:type="gramStart"/>
-      <w:r>
-        <w:rPr>
-          <w:rFonts w:ascii="Times New Roman" w:hAnsi="Times New Roman" w:cs="Times New Roman"/>
-          <w:b/>
-          <w:sz w:val="28"/>
-          <w:szCs w:val="28"/>
-        </w:rPr>
-        <w:t>:</w:t>
+        <w:t>Цель работы:</w:t>
       </w:r>
       <w:r>
         <w:rPr>
@@ -190,16 +180,7 @@
           <w:sz w:val="28"/>
           <w:szCs w:val="28"/>
         </w:rPr>
-        <w:t>Проанализировать</w:t>
-      </w:r>
-      <w:proofErr w:type="gramEnd"/>
-      <w:r>
-        <w:rPr>
-          <w:rFonts w:ascii="Times New Roman" w:hAnsi="Times New Roman" w:cs="Times New Roman"/>
-          <w:sz w:val="28"/>
-          <w:szCs w:val="28"/>
-        </w:rPr>
-        <w:t xml:space="preserve"> целевую аудиторию и выявить её потребности</w:t>
+        <w:t>Проанализировать целевую аудиторию и выявить её потребности</w:t>
       </w:r>
       <w:r>
         <w:rPr>
@@ -916,29 +897,7 @@
           <w:szCs w:val="28"/>
           <w:shd w:val="clear" w:color="auto" w:fill="FFFFFF"/>
         </w:rPr>
-        <w:t xml:space="preserve">ность в описанных преимуществах (это </w:t>
-      </w:r>
-      <w:proofErr w:type="gramStart"/>
-      <w:r>
-        <w:rPr>
-          <w:rFonts w:ascii="Times New Roman" w:hAnsi="Times New Roman" w:cs="Times New Roman"/>
-          <w:color w:val="000000"/>
-          <w:sz w:val="28"/>
-          <w:szCs w:val="28"/>
-          <w:shd w:val="clear" w:color="auto" w:fill="FFFFFF"/>
-        </w:rPr>
-        <w:t>можно сделать</w:t>
-      </w:r>
-      <w:proofErr w:type="gramEnd"/>
-      <w:r>
-        <w:rPr>
-          <w:rFonts w:ascii="Times New Roman" w:hAnsi="Times New Roman" w:cs="Times New Roman"/>
-          <w:color w:val="000000"/>
-          <w:sz w:val="28"/>
-          <w:szCs w:val="28"/>
-          <w:shd w:val="clear" w:color="auto" w:fill="FFFFFF"/>
-        </w:rPr>
-        <w:t xml:space="preserve"> проанализировав аудиторию, на которую нацелены конкуренты). </w:t>
+        <w:t xml:space="preserve">ность в описанных преимуществах (это можно сделать проанализировав аудиторию, на которую нацелены конкуренты). </w:t>
       </w:r>
     </w:p>
     <w:p>
@@ -2824,75 +2783,7 @@
           <w:sz w:val="28"/>
           <w:szCs w:val="28"/>
         </w:rPr>
-        <w:t xml:space="preserve"> — это короткая история с описанием возможных </w:t>
-      </w:r>
-      <w:proofErr w:type="spellStart"/>
-      <w:r>
-        <w:rPr>
-          <w:rFonts w:ascii="Times New Roman" w:hAnsi="Times New Roman" w:cs="Times New Roman"/>
-          <w:sz w:val="28"/>
-          <w:szCs w:val="28"/>
-        </w:rPr>
-        <w:t>вариан</w:t>
-      </w:r>
-      <w:proofErr w:type="spellEnd"/>
-      <w:r>
-        <w:rPr>
-          <w:rFonts w:ascii="Times New Roman" w:hAnsi="Times New Roman" w:cs="Times New Roman"/>
-          <w:sz w:val="28"/>
-          <w:szCs w:val="28"/>
-        </w:rPr>
-        <w:tab/>
-      </w:r>
-      <w:r>
-        <w:rPr>
-          <w:rFonts w:ascii="Times New Roman" w:hAnsi="Times New Roman" w:cs="Times New Roman"/>
-          <w:sz w:val="28"/>
-          <w:szCs w:val="28"/>
-        </w:rPr>
-        <w:tab/>
-      </w:r>
-      <w:r>
-        <w:rPr>
-          <w:rFonts w:ascii="Times New Roman" w:hAnsi="Times New Roman" w:cs="Times New Roman"/>
-          <w:sz w:val="28"/>
-          <w:szCs w:val="28"/>
-        </w:rPr>
-        <w:tab/>
-      </w:r>
-      <w:r>
-        <w:rPr>
-          <w:rFonts w:ascii="Times New Roman" w:hAnsi="Times New Roman" w:cs="Times New Roman"/>
-          <w:sz w:val="28"/>
-          <w:szCs w:val="28"/>
-        </w:rPr>
-        <w:tab/>
-      </w:r>
-      <w:r>
-        <w:rPr>
-          <w:rFonts w:ascii="Times New Roman" w:hAnsi="Times New Roman" w:cs="Times New Roman"/>
-          <w:sz w:val="28"/>
-          <w:szCs w:val="28"/>
-        </w:rPr>
-        <w:tab/>
-      </w:r>
-      <w:proofErr w:type="spellStart"/>
-      <w:r>
-        <w:rPr>
-          <w:rFonts w:ascii="Times New Roman" w:hAnsi="Times New Roman" w:cs="Times New Roman"/>
-          <w:sz w:val="28"/>
-          <w:szCs w:val="28"/>
-        </w:rPr>
-        <w:t>тов</w:t>
-      </w:r>
-      <w:proofErr w:type="spellEnd"/>
-      <w:r>
-        <w:rPr>
-          <w:rFonts w:ascii="Times New Roman" w:hAnsi="Times New Roman" w:cs="Times New Roman"/>
-          <w:sz w:val="28"/>
-          <w:szCs w:val="28"/>
-        </w:rPr>
-        <w:t xml:space="preserve"> применения продукта.</w:t>
+        <w:t xml:space="preserve"> — это короткая история с описанием возможных вариантов применения продукта.</w:t>
       </w:r>
       <w:r>
         <w:rPr>

</xml_diff>